<commit_message>
fix: stabilize KL document classification
</commit_message>
<xml_diff>
--- a/src/docxspec/assets/docxspec_master_template.docx
+++ b/src/docxspec/assets/docxspec_master_template.docx
@@ -4,9 +4,14 @@
   <w:body>
     <w:p>
       <w:pPr>
-        <w:pStyle w:val="34"/>
+        <w:pStyle w:val="31"/>
+        <w:numPr>
+          <w:numId w:val="0"/>
+        </w:numPr>
         <w:spacing w:line="360" w:lineRule="auto"/>
-        <w:jc w:val="right"/>
+        <w:ind w:leftChars="0" w:firstLine="5600" w:firstLineChars="2000"/>
+        <w:jc w:val="both"/>
+        <w:outlineLvl w:val="9"/>
         <w:rPr>
           <w:rFonts w:hint="eastAsia" w:ascii="宋体" w:hAnsi="宋体" w:eastAsia="宋体" w:cs="宋体"/>
           <w:sz w:val="28"/>
@@ -57,9 +62,36 @@
     </w:p>
     <w:p>
       <w:pPr>
-        <w:pStyle w:val="34"/>
+        <w:pStyle w:val="33"/>
+        <w:bidi w:val="0"/>
+        <w:ind w:left="0" w:leftChars="0" w:firstLine="0" w:firstLineChars="0"/>
+        <w:rPr>
+          <w:rFonts w:hint="eastAsia"/>
+          <w:lang w:eastAsia="zh-CN"/>
+        </w:rPr>
+      </w:pPr>
+    </w:p>
+    <w:p>
+      <w:pPr>
+        <w:pStyle w:val="33"/>
+        <w:bidi w:val="0"/>
+        <w:ind w:left="0" w:leftChars="0" w:firstLine="0" w:firstLineChars="0"/>
+        <w:rPr>
+          <w:rFonts w:hint="eastAsia"/>
+          <w:lang w:eastAsia="zh-CN"/>
+        </w:rPr>
+      </w:pPr>
+    </w:p>
+    <w:p>
+      <w:pPr>
+        <w:pStyle w:val="31"/>
+        <w:numPr>
+          <w:numId w:val="0"/>
+        </w:numPr>
         <w:spacing w:before="156" w:beforeLines="50" w:after="156" w:afterLines="50" w:line="480" w:lineRule="auto"/>
-        <w:jc w:val="center"/>
+        <w:ind w:leftChars="0" w:firstLine="3520" w:firstLineChars="800"/>
+        <w:jc w:val="both"/>
+        <w:outlineLvl w:val="9"/>
         <w:rPr>
           <w:rFonts w:hint="eastAsia" w:ascii="宋体" w:hAnsi="宋体" w:eastAsia="宋体" w:cs="宋体"/>
           <w:sz w:val="44"/>
@@ -67,25 +99,26 @@
           <w:lang w:eastAsia="zh-CN"/>
         </w:rPr>
       </w:pPr>
-    </w:p>
-    <w:p>
-      <w:pPr>
-        <w:pStyle w:val="34"/>
-        <w:spacing w:before="156" w:beforeLines="50" w:after="156" w:afterLines="50" w:line="480" w:lineRule="auto"/>
-        <w:jc w:val="center"/>
+      <w:r>
         <w:rPr>
           <w:rFonts w:hint="eastAsia" w:ascii="宋体" w:hAnsi="宋体" w:eastAsia="宋体" w:cs="宋体"/>
           <w:sz w:val="44"/>
           <w:szCs w:val="44"/>
           <w:lang w:eastAsia="zh-CN"/>
         </w:rPr>
-      </w:pPr>
+        <w:t>XXXX系统</w:t>
+      </w:r>
     </w:p>
     <w:p>
       <w:pPr>
-        <w:pStyle w:val="34"/>
+        <w:pStyle w:val="31"/>
+        <w:numPr>
+          <w:numId w:val="0"/>
+        </w:numPr>
         <w:spacing w:before="156" w:beforeLines="50" w:after="156" w:afterLines="50" w:line="480" w:lineRule="auto"/>
-        <w:jc w:val="center"/>
+        <w:ind w:leftChars="0" w:firstLine="3520" w:firstLineChars="800"/>
+        <w:jc w:val="both"/>
+        <w:outlineLvl w:val="9"/>
         <w:rPr>
           <w:rFonts w:hint="eastAsia" w:ascii="宋体" w:hAnsi="宋体" w:eastAsia="宋体" w:cs="宋体"/>
           <w:sz w:val="44"/>
@@ -95,111 +128,92 @@
       </w:pPr>
       <w:r>
         <w:rPr>
+          <w:rFonts w:hint="eastAsia" w:cs="宋体"/>
+          <w:sz w:val="44"/>
+          <w:szCs w:val="44"/>
+          <w:lang w:val="en-US" w:eastAsia="zh-CN"/>
+        </w:rPr>
+        <w:t>技</w:t>
+      </w:r>
+      <w:r>
+        <w:rPr>
           <w:rFonts w:hint="eastAsia" w:ascii="宋体" w:hAnsi="宋体" w:eastAsia="宋体" w:cs="宋体"/>
           <w:sz w:val="44"/>
           <w:szCs w:val="44"/>
           <w:lang w:eastAsia="zh-CN"/>
         </w:rPr>
-        <w:t>XXXX系统</w:t>
+        <w:t>术方案</w:t>
       </w:r>
     </w:p>
     <w:p>
       <w:pPr>
-        <w:pStyle w:val="34"/>
-        <w:spacing w:before="156" w:beforeLines="50" w:after="156" w:afterLines="50" w:line="480" w:lineRule="auto"/>
-        <w:jc w:val="center"/>
-        <w:rPr>
-          <w:rFonts w:hint="eastAsia" w:ascii="宋体" w:hAnsi="宋体" w:eastAsia="宋体" w:cs="宋体"/>
-          <w:sz w:val="44"/>
-          <w:szCs w:val="44"/>
+        <w:pStyle w:val="33"/>
+        <w:bidi w:val="0"/>
+        <w:ind w:left="0" w:leftChars="0" w:firstLine="0" w:firstLineChars="0"/>
+        <w:rPr>
+          <w:rFonts w:hint="eastAsia"/>
           <w:lang w:eastAsia="zh-CN"/>
         </w:rPr>
       </w:pPr>
-      <w:r>
-        <w:rPr>
-          <w:rFonts w:hint="eastAsia" w:ascii="宋体" w:hAnsi="宋体" w:eastAsia="宋体" w:cs="宋体"/>
-          <w:sz w:val="44"/>
-          <w:szCs w:val="44"/>
-          <w:lang w:eastAsia="zh-CN"/>
-        </w:rPr>
-        <w:t>技术方案</w:t>
-      </w:r>
     </w:p>
     <w:p>
       <w:pPr>
-        <w:widowControl/>
-        <w:spacing w:line="360" w:lineRule="auto"/>
-        <w:jc w:val="left"/>
-        <w:rPr>
-          <w:rFonts w:hint="eastAsia" w:ascii="宋体" w:hAnsi="宋体" w:eastAsia="宋体" w:cs="宋体"/>
-          <w:sz w:val="24"/>
-          <w:szCs w:val="24"/>
+        <w:pStyle w:val="33"/>
+        <w:bidi w:val="0"/>
+        <w:ind w:left="0" w:leftChars="0" w:firstLine="0" w:firstLineChars="0"/>
+        <w:rPr>
+          <w:rFonts w:hint="eastAsia"/>
+          <w:lang w:eastAsia="zh-CN"/>
         </w:rPr>
       </w:pPr>
     </w:p>
     <w:p>
       <w:pPr>
-        <w:widowControl/>
-        <w:spacing w:line="360" w:lineRule="auto"/>
-        <w:jc w:val="left"/>
-        <w:rPr>
-          <w:rFonts w:hint="eastAsia" w:ascii="宋体" w:hAnsi="宋体" w:eastAsia="宋体" w:cs="宋体"/>
-          <w:sz w:val="24"/>
-          <w:szCs w:val="24"/>
+        <w:pStyle w:val="33"/>
+        <w:bidi w:val="0"/>
+        <w:ind w:left="0" w:leftChars="0" w:firstLine="0" w:firstLineChars="0"/>
+        <w:rPr>
+          <w:rFonts w:hint="eastAsia"/>
+          <w:lang w:eastAsia="zh-CN"/>
         </w:rPr>
       </w:pPr>
     </w:p>
     <w:p>
       <w:pPr>
-        <w:widowControl/>
-        <w:spacing w:line="360" w:lineRule="auto"/>
-        <w:jc w:val="left"/>
-        <w:rPr>
-          <w:rFonts w:hint="eastAsia" w:ascii="宋体" w:hAnsi="宋体" w:eastAsia="宋体" w:cs="宋体"/>
-          <w:sz w:val="24"/>
-          <w:szCs w:val="24"/>
+        <w:pStyle w:val="33"/>
+        <w:bidi w:val="0"/>
+        <w:ind w:left="0" w:leftChars="0" w:firstLine="0" w:firstLineChars="0"/>
+        <w:rPr>
+          <w:rFonts w:hint="eastAsia"/>
+          <w:lang w:eastAsia="zh-CN"/>
         </w:rPr>
       </w:pPr>
     </w:p>
     <w:p>
       <w:pPr>
-        <w:widowControl/>
-        <w:spacing w:line="360" w:lineRule="auto"/>
-        <w:jc w:val="left"/>
-        <w:rPr>
-          <w:rFonts w:hint="eastAsia" w:ascii="宋体" w:hAnsi="宋体" w:eastAsia="宋体" w:cs="宋体"/>
-          <w:sz w:val="24"/>
-          <w:szCs w:val="24"/>
+        <w:pStyle w:val="33"/>
+        <w:bidi w:val="0"/>
+        <w:ind w:left="0" w:leftChars="0" w:firstLine="0" w:firstLineChars="0"/>
+        <w:rPr>
+          <w:rFonts w:hint="eastAsia"/>
+          <w:lang w:eastAsia="zh-CN"/>
         </w:rPr>
       </w:pPr>
     </w:p>
     <w:p>
       <w:pPr>
-        <w:widowControl/>
-        <w:spacing w:line="360" w:lineRule="auto"/>
-        <w:jc w:val="left"/>
-        <w:rPr>
-          <w:rFonts w:hint="eastAsia" w:ascii="宋体" w:hAnsi="宋体" w:eastAsia="宋体" w:cs="宋体"/>
-          <w:sz w:val="24"/>
-          <w:szCs w:val="24"/>
-        </w:rPr>
-      </w:pPr>
-    </w:p>
-    <w:p>
-      <w:pPr>
-        <w:widowControl/>
-        <w:spacing w:line="360" w:lineRule="auto"/>
-        <w:jc w:val="left"/>
-        <w:rPr>
-          <w:rFonts w:hint="eastAsia" w:ascii="宋体" w:hAnsi="宋体" w:eastAsia="宋体" w:cs="宋体"/>
-          <w:sz w:val="24"/>
-          <w:szCs w:val="24"/>
+        <w:pStyle w:val="33"/>
+        <w:bidi w:val="0"/>
+        <w:ind w:left="0" w:leftChars="0" w:firstLine="0" w:firstLineChars="0"/>
+        <w:rPr>
+          <w:rFonts w:hint="eastAsia"/>
+          <w:lang w:eastAsia="zh-CN"/>
         </w:rPr>
       </w:pPr>
     </w:p>
     <w:tbl>
       <w:tblPr>
-        <w:tblStyle w:val="13"/>
+        <w:tblStyle w:val="16"/>
         <w:tblW w:w="0" w:type="auto"/>
         <w:jc w:val="center"/>
         <w:tblBorders>
@@ -231,6 +245,12 @@
             <w:insideH w:val="none" w:color="auto" w:sz="0" w:space="0"/>
             <w:insideV w:val="none" w:color="auto" w:sz="0" w:space="0"/>
           </w:tblBorders>
+          <w:tblCellMar>
+            <w:top w:w="0" w:type="dxa"/>
+            <w:left w:w="108" w:type="dxa"/>
+            <w:bottom w:w="0" w:type="dxa"/>
+            <w:right w:w="108" w:type="dxa"/>
+          </w:tblCellMar>
         </w:tblPrEx>
         <w:trPr>
           <w:jc w:val="center"/>
@@ -439,61 +459,56 @@
     </w:tbl>
     <w:p>
       <w:pPr>
-        <w:widowControl/>
-        <w:spacing w:line="360" w:lineRule="auto"/>
-        <w:jc w:val="left"/>
-        <w:rPr>
-          <w:rFonts w:hint="eastAsia" w:ascii="宋体" w:hAnsi="宋体" w:eastAsia="宋体" w:cs="宋体"/>
-          <w:sz w:val="24"/>
-          <w:szCs w:val="24"/>
+        <w:pStyle w:val="33"/>
+        <w:bidi w:val="0"/>
+        <w:ind w:left="0" w:leftChars="0" w:firstLine="0" w:firstLineChars="0"/>
+        <w:rPr>
+          <w:rFonts w:hint="eastAsia"/>
+          <w:lang w:eastAsia="zh-CN"/>
         </w:rPr>
       </w:pPr>
     </w:p>
     <w:p>
       <w:pPr>
-        <w:widowControl/>
-        <w:spacing w:line="360" w:lineRule="auto"/>
-        <w:jc w:val="left"/>
-        <w:rPr>
-          <w:rFonts w:hint="eastAsia" w:ascii="宋体" w:hAnsi="宋体" w:eastAsia="宋体" w:cs="宋体"/>
-          <w:sz w:val="24"/>
-          <w:szCs w:val="24"/>
+        <w:pStyle w:val="33"/>
+        <w:bidi w:val="0"/>
+        <w:ind w:left="0" w:leftChars="0" w:firstLine="0" w:firstLineChars="0"/>
+        <w:rPr>
+          <w:rFonts w:hint="eastAsia"/>
+          <w:lang w:eastAsia="zh-CN"/>
         </w:rPr>
       </w:pPr>
     </w:p>
     <w:p>
       <w:pPr>
-        <w:widowControl/>
-        <w:spacing w:line="360" w:lineRule="auto"/>
-        <w:jc w:val="left"/>
-        <w:rPr>
-          <w:rFonts w:hint="eastAsia" w:ascii="宋体" w:hAnsi="宋体" w:eastAsia="宋体" w:cs="宋体"/>
-          <w:sz w:val="24"/>
-          <w:szCs w:val="24"/>
+        <w:pStyle w:val="33"/>
+        <w:bidi w:val="0"/>
+        <w:ind w:left="0" w:leftChars="0" w:firstLine="0" w:firstLineChars="0"/>
+        <w:rPr>
+          <w:rFonts w:hint="eastAsia"/>
+          <w:lang w:eastAsia="zh-CN"/>
         </w:rPr>
       </w:pPr>
     </w:p>
     <w:p>
       <w:pPr>
-        <w:widowControl/>
-        <w:spacing w:line="360" w:lineRule="auto"/>
-        <w:jc w:val="left"/>
-        <w:rPr>
-          <w:rFonts w:hint="eastAsia" w:ascii="宋体" w:hAnsi="宋体" w:eastAsia="宋体" w:cs="宋体"/>
-          <w:sz w:val="24"/>
-          <w:szCs w:val="24"/>
+        <w:pStyle w:val="33"/>
+        <w:bidi w:val="0"/>
+        <w:ind w:left="0" w:leftChars="0" w:firstLine="0" w:firstLineChars="0"/>
+        <w:rPr>
+          <w:rFonts w:hint="eastAsia"/>
+          <w:lang w:eastAsia="zh-CN"/>
         </w:rPr>
       </w:pPr>
     </w:p>
     <w:p>
       <w:pPr>
-        <w:widowControl/>
-        <w:spacing w:line="360" w:lineRule="auto"/>
-        <w:jc w:val="left"/>
-        <w:rPr>
-          <w:rFonts w:hint="eastAsia" w:ascii="宋体" w:hAnsi="宋体" w:eastAsia="宋体" w:cs="宋体"/>
-          <w:sz w:val="24"/>
-          <w:szCs w:val="24"/>
+        <w:pStyle w:val="33"/>
+        <w:bidi w:val="0"/>
+        <w:ind w:left="0" w:leftChars="0" w:firstLine="0" w:firstLineChars="0"/>
+        <w:rPr>
+          <w:rFonts w:hint="eastAsia"/>
+          <w:lang w:eastAsia="zh-CN"/>
         </w:rPr>
       </w:pPr>
     </w:p>
@@ -623,6 +638,16 @@
           <w:sz w:val="24"/>
           <w:szCs w:val="24"/>
         </w:rPr>
+      </w:pPr>
+    </w:p>
+    <w:p>
+      <w:pPr>
+        <w:spacing w:line="360" w:lineRule="auto"/>
+        <w:rPr>
+          <w:rFonts w:hint="eastAsia" w:ascii="宋体" w:hAnsi="宋体" w:eastAsia="宋体" w:cs="宋体"/>
+          <w:sz w:val="24"/>
+          <w:szCs w:val="24"/>
+        </w:rPr>
         <w:sectPr>
           <w:headerReference r:id="rId7" w:type="first"/>
           <w:footerReference r:id="rId10" w:type="first"/>
@@ -640,7 +665,7 @@
     </w:p>
     <w:tbl>
       <w:tblPr>
-        <w:tblStyle w:val="13"/>
+        <w:tblStyle w:val="16"/>
         <w:tblW w:w="0" w:type="auto"/>
         <w:tblInd w:w="0" w:type="dxa"/>
         <w:tblBorders>
@@ -1230,12 +1255,13 @@
     <w:sdt>
       <w:sdtPr>
         <w:rPr>
-          <w:rFonts w:hint="eastAsia"/>
-          <w:b/>
-          <w:bCs/>
-          <w:lang w:val="en-US" w:eastAsia="zh-CN"/>
-        </w:rPr>
-        <w:id w:val="147464479"/>
+          <w:rFonts w:ascii="宋体" w:hAnsi="宋体" w:eastAsia="宋体" w:cstheme="minorBidi"/>
+          <w:kern w:val="2"/>
+          <w:sz w:val="21"/>
+          <w:szCs w:val="21"/>
+          <w:lang w:val="en-US" w:eastAsia="zh-CN" w:bidi="ar-SA"/>
+        </w:rPr>
+        <w:id w:val="147466697"/>
         <w15:color w:val="DBDBDB"/>
         <w:docPartObj>
           <w:docPartGallery w:val="Table of Contents"/>
@@ -1245,81 +1271,69 @@
       <w:sdtEndPr>
         <w:rPr>
           <w:rFonts w:hint="eastAsia" w:ascii="宋体" w:hAnsi="宋体" w:eastAsia="宋体" w:cs="宋体"/>
-          <w:b/>
-          <w:bCs/>
-          <w:lang w:val="en-US" w:eastAsia="zh-CN"/>
+          <w:color w:val="000000"/>
+          <w:kern w:val="2"/>
+          <w:sz w:val="24"/>
+          <w:szCs w:val="28"/>
+          <w:lang w:val="en-US" w:eastAsia="zh-CN" w:bidi="ar-SA"/>
         </w:rPr>
       </w:sdtEndPr>
       <w:sdtContent>
         <w:p>
           <w:pPr>
-            <w:pStyle w:val="9"/>
-            <w:bidi w:val="0"/>
+            <w:spacing w:before="0" w:beforeLines="0" w:after="0" w:afterLines="0" w:line="240" w:lineRule="auto"/>
+            <w:ind w:left="0" w:leftChars="0" w:right="0" w:rightChars="0" w:firstLine="0" w:firstLineChars="0"/>
             <w:jc w:val="center"/>
+          </w:pPr>
+          <w:r>
             <w:rPr>
+              <w:rStyle w:val="45"/>
+            </w:rPr>
+            <w:t>目</w:t>
+          </w:r>
+          <w:r>
+            <w:rPr>
+              <w:rStyle w:val="45"/>
               <w:rFonts w:hint="eastAsia"/>
-              <w:b/>
-              <w:bCs/>
+              <w:lang w:val="en-US" w:eastAsia="zh-CN"/>
             </w:rPr>
-          </w:pPr>
+            <w:t xml:space="preserve"> </w:t>
+          </w:r>
           <w:r>
             <w:rPr>
-              <w:rFonts w:hint="eastAsia"/>
-              <w:b/>
-              <w:bCs/>
+              <w:rStyle w:val="45"/>
             </w:rPr>
-            <w:t>目录</w:t>
+            <w:t>录</w:t>
           </w:r>
         </w:p>
         <w:p>
           <w:pPr>
-            <w:pStyle w:val="9"/>
+            <w:pStyle w:val="10"/>
             <w:tabs>
               <w:tab w:val="right" w:leader="dot" w:pos="8787"/>
             </w:tabs>
+          </w:pPr>
+          <w:r>
+            <w:fldChar w:fldCharType="begin"/>
+          </w:r>
+          <w:r>
+            <w:instrText xml:space="preserve">TOC \o "1-7" \h \u </w:instrText>
+          </w:r>
+          <w:r>
+            <w:fldChar w:fldCharType="separate"/>
+          </w:r>
+          <w:r>
+            <w:fldChar w:fldCharType="begin"/>
+          </w:r>
+          <w:r>
+            <w:instrText xml:space="preserve"> HYPERLINK \l _Toc22766 </w:instrText>
+          </w:r>
+          <w:r>
+            <w:fldChar w:fldCharType="separate"/>
+          </w:r>
+          <w:r>
             <w:rPr>
-              <w:rFonts w:hint="eastAsia" w:ascii="宋体" w:hAnsi="宋体" w:eastAsia="宋体" w:cs="宋体"/>
-            </w:rPr>
-          </w:pPr>
-          <w:r>
-            <w:rPr>
-              <w:rFonts w:hint="eastAsia" w:ascii="宋体" w:hAnsi="宋体" w:eastAsia="宋体" w:cs="宋体"/>
-            </w:rPr>
-            <w:fldChar w:fldCharType="begin"/>
-          </w:r>
-          <w:r>
-            <w:rPr>
-              <w:rFonts w:hint="eastAsia" w:ascii="宋体" w:hAnsi="宋体" w:eastAsia="宋体" w:cs="宋体"/>
-            </w:rPr>
-            <w:instrText xml:space="preserve">TOC \o "1-2" \h \u </w:instrText>
-          </w:r>
-          <w:r>
-            <w:rPr>
-              <w:rFonts w:hint="eastAsia" w:ascii="宋体" w:hAnsi="宋体" w:eastAsia="宋体" w:cs="宋体"/>
-            </w:rPr>
-            <w:fldChar w:fldCharType="separate"/>
-          </w:r>
-          <w:r>
-            <w:rPr>
-              <w:rFonts w:hint="eastAsia" w:ascii="宋体" w:hAnsi="宋体" w:eastAsia="宋体" w:cs="宋体"/>
-            </w:rPr>
-            <w:fldChar w:fldCharType="begin"/>
-          </w:r>
-          <w:r>
-            <w:rPr>
-              <w:rFonts w:hint="eastAsia" w:ascii="宋体" w:hAnsi="宋体" w:eastAsia="宋体" w:cs="宋体"/>
-            </w:rPr>
-            <w:instrText xml:space="preserve"> HYPERLINK \l _Toc10024 </w:instrText>
-          </w:r>
-          <w:r>
-            <w:rPr>
-              <w:rFonts w:hint="eastAsia" w:ascii="宋体" w:hAnsi="宋体" w:eastAsia="宋体" w:cs="宋体"/>
-            </w:rPr>
-            <w:fldChar w:fldCharType="separate"/>
-          </w:r>
-          <w:r>
-            <w:rPr>
-              <w:rFonts w:hint="eastAsia" w:ascii="宋体" w:hAnsi="宋体" w:eastAsia="宋体" w:cs="宋体"/>
+              <w:rFonts w:hint="default" w:ascii="宋体" w:hAnsi="宋体" w:eastAsia="宋体" w:cs="宋体"/>
               <w:bCs/>
               <w:szCs w:val="24"/>
             </w:rPr>
@@ -1333,45 +1347,129 @@
             <w:t>KL一级标题</w:t>
           </w:r>
           <w:r>
+            <w:tab/>
+          </w:r>
+          <w:r>
+            <w:fldChar w:fldCharType="begin"/>
+          </w:r>
+          <w:r>
+            <w:instrText xml:space="preserve"> PAGEREF _Toc22766 \h </w:instrText>
+          </w:r>
+          <w:r>
+            <w:fldChar w:fldCharType="separate"/>
+          </w:r>
+          <w:r>
+            <w:t>1</w:t>
+          </w:r>
+          <w:r>
+            <w:fldChar w:fldCharType="end"/>
+          </w:r>
+          <w:r>
+            <w:fldChar w:fldCharType="end"/>
+          </w:r>
+        </w:p>
+        <w:p>
+          <w:pPr>
+            <w:pStyle w:val="14"/>
+            <w:tabs>
+              <w:tab w:val="right" w:leader="dot" w:pos="8787"/>
+            </w:tabs>
+          </w:pPr>
+          <w:r>
+            <w:fldChar w:fldCharType="begin"/>
+          </w:r>
+          <w:r>
+            <w:instrText xml:space="preserve"> HYPERLINK \l _Toc14165 </w:instrText>
+          </w:r>
+          <w:r>
+            <w:fldChar w:fldCharType="separate"/>
+          </w:r>
+          <w:r>
+            <w:rPr>
+              <w:rFonts w:hint="default" w:ascii="宋体" w:hAnsi="宋体" w:eastAsia="宋体" w:cs="宋体"/>
+              <w:bCs/>
+              <w:szCs w:val="24"/>
+            </w:rPr>
+            <w:t xml:space="preserve">1.1 </w:t>
+          </w:r>
+          <w:r>
             <w:rPr>
               <w:rFonts w:hint="eastAsia" w:ascii="宋体" w:hAnsi="宋体" w:eastAsia="宋体" w:cs="宋体"/>
+              <w:lang w:val="en-US" w:eastAsia="zh-CN"/>
             </w:rPr>
+            <w:t>KL二级标题</w:t>
+          </w:r>
+          <w:r>
             <w:tab/>
+          </w:r>
+          <w:r>
+            <w:fldChar w:fldCharType="begin"/>
+          </w:r>
+          <w:r>
+            <w:instrText xml:space="preserve"> PAGEREF _Toc14165 \h </w:instrText>
+          </w:r>
+          <w:r>
+            <w:fldChar w:fldCharType="separate"/>
+          </w:r>
+          <w:r>
+            <w:t>1</w:t>
+          </w:r>
+          <w:r>
+            <w:fldChar w:fldCharType="end"/>
+          </w:r>
+          <w:r>
+            <w:fldChar w:fldCharType="end"/>
+          </w:r>
+        </w:p>
+        <w:p>
+          <w:pPr>
+            <w:pStyle w:val="7"/>
+            <w:tabs>
+              <w:tab w:val="right" w:leader="dot" w:pos="8787"/>
+            </w:tabs>
+          </w:pPr>
+          <w:r>
+            <w:fldChar w:fldCharType="begin"/>
+          </w:r>
+          <w:r>
+            <w:instrText xml:space="preserve"> HYPERLINK \l _Toc22193 </w:instrText>
+          </w:r>
+          <w:r>
+            <w:fldChar w:fldCharType="separate"/>
+          </w:r>
+          <w:r>
+            <w:rPr>
+              <w:rFonts w:hint="default" w:ascii="宋体" w:hAnsi="宋体" w:eastAsia="宋体" w:cs="宋体"/>
+              <w:szCs w:val="24"/>
+            </w:rPr>
+            <w:t xml:space="preserve">1.1.1 </w:t>
           </w:r>
           <w:r>
             <w:rPr>
               <w:rFonts w:hint="eastAsia" w:ascii="宋体" w:hAnsi="宋体" w:eastAsia="宋体" w:cs="宋体"/>
+              <w:lang w:val="en-US" w:eastAsia="zh-CN"/>
             </w:rPr>
+            <w:t>KL三级标题</w:t>
+          </w:r>
+          <w:r>
+            <w:tab/>
+          </w:r>
+          <w:r>
             <w:fldChar w:fldCharType="begin"/>
           </w:r>
           <w:r>
-            <w:rPr>
-              <w:rFonts w:hint="eastAsia" w:ascii="宋体" w:hAnsi="宋体" w:eastAsia="宋体" w:cs="宋体"/>
-            </w:rPr>
-            <w:instrText xml:space="preserve"> PAGEREF _Toc10024 \h </w:instrText>
-          </w:r>
-          <w:r>
-            <w:rPr>
-              <w:rFonts w:hint="eastAsia" w:ascii="宋体" w:hAnsi="宋体" w:eastAsia="宋体" w:cs="宋体"/>
-            </w:rPr>
+            <w:instrText xml:space="preserve"> PAGEREF _Toc22193 \h </w:instrText>
+          </w:r>
+          <w:r>
             <w:fldChar w:fldCharType="separate"/>
           </w:r>
           <w:r>
-            <w:rPr>
-              <w:rFonts w:hint="eastAsia" w:ascii="宋体" w:hAnsi="宋体" w:eastAsia="宋体" w:cs="宋体"/>
-            </w:rPr>
-            <w:t>8</w:t>
-          </w:r>
-          <w:r>
-            <w:rPr>
-              <w:rFonts w:hint="eastAsia" w:ascii="宋体" w:hAnsi="宋体" w:eastAsia="宋体" w:cs="宋体"/>
-            </w:rPr>
+            <w:t>1</w:t>
+          </w:r>
+          <w:r>
             <w:fldChar w:fldCharType="end"/>
           </w:r>
           <w:r>
-            <w:rPr>
-              <w:rFonts w:hint="eastAsia" w:ascii="宋体" w:hAnsi="宋体" w:eastAsia="宋体" w:cs="宋体"/>
-            </w:rPr>
             <w:fldChar w:fldCharType="end"/>
           </w:r>
         </w:p>
@@ -1381,35 +1479,236 @@
             <w:tabs>
               <w:tab w:val="right" w:leader="dot" w:pos="8787"/>
             </w:tabs>
+          </w:pPr>
+          <w:r>
+            <w:fldChar w:fldCharType="begin"/>
+          </w:r>
+          <w:r>
+            <w:instrText xml:space="preserve"> HYPERLINK \l _Toc8986 </w:instrText>
+          </w:r>
+          <w:r>
+            <w:fldChar w:fldCharType="separate"/>
+          </w:r>
+          <w:r>
+            <w:rPr>
+              <w:rFonts w:hint="default" w:ascii="宋体" w:hAnsi="宋体" w:eastAsia="宋体" w:cs="宋体"/>
+            </w:rPr>
+            <w:t xml:space="preserve">1.1.1.1 </w:t>
+          </w:r>
+          <w:r>
             <w:rPr>
               <w:rFonts w:hint="eastAsia" w:ascii="宋体" w:hAnsi="宋体" w:eastAsia="宋体" w:cs="宋体"/>
+              <w:lang w:val="en-US" w:eastAsia="zh-CN"/>
             </w:rPr>
+            <w:t>KL</w:t>
+          </w:r>
+          <w:r>
+            <w:rPr>
+              <w:rFonts w:hint="eastAsia" w:cs="宋体"/>
+              <w:lang w:val="en-US" w:eastAsia="zh-CN"/>
+            </w:rPr>
+            <w:t>四级标题</w:t>
+          </w:r>
+          <w:r>
+            <w:tab/>
+          </w:r>
+          <w:r>
+            <w:fldChar w:fldCharType="begin"/>
+          </w:r>
+          <w:r>
+            <w:instrText xml:space="preserve"> PAGEREF _Toc8986 \h </w:instrText>
+          </w:r>
+          <w:r>
+            <w:fldChar w:fldCharType="separate"/>
+          </w:r>
+          <w:r>
+            <w:t>1</w:t>
+          </w:r>
+          <w:r>
+            <w:fldChar w:fldCharType="end"/>
+          </w:r>
+          <w:r>
+            <w:fldChar w:fldCharType="end"/>
+          </w:r>
+        </w:p>
+        <w:p>
+          <w:pPr>
+            <w:pStyle w:val="6"/>
+            <w:tabs>
+              <w:tab w:val="right" w:leader="dot" w:pos="8787"/>
+            </w:tabs>
           </w:pPr>
           <w:r>
+            <w:fldChar w:fldCharType="begin"/>
+          </w:r>
+          <w:r>
+            <w:instrText xml:space="preserve"> HYPERLINK \l _Toc28628 </w:instrText>
+          </w:r>
+          <w:r>
+            <w:fldChar w:fldCharType="separate"/>
+          </w:r>
+          <w:r>
             <w:rPr>
-              <w:rFonts w:hint="eastAsia" w:ascii="宋体" w:hAnsi="宋体" w:eastAsia="宋体" w:cs="宋体"/>
+              <w:rFonts w:hint="default"/>
             </w:rPr>
+            <w:t xml:space="preserve">1.1.1.1.1 </w:t>
+          </w:r>
+          <w:r>
+            <w:rPr>
+              <w:rFonts w:hint="eastAsia" w:cs="宋体"/>
+              <w:lang w:val="en-US" w:eastAsia="zh-CN"/>
+            </w:rPr>
+            <w:t>KL五级标题</w:t>
+          </w:r>
+          <w:r>
+            <w:tab/>
+          </w:r>
+          <w:r>
             <w:fldChar w:fldCharType="begin"/>
           </w:r>
           <w:r>
+            <w:instrText xml:space="preserve"> PAGEREF _Toc28628 \h </w:instrText>
+          </w:r>
+          <w:r>
+            <w:fldChar w:fldCharType="separate"/>
+          </w:r>
+          <w:r>
+            <w:t>1</w:t>
+          </w:r>
+          <w:r>
+            <w:fldChar w:fldCharType="end"/>
+          </w:r>
+          <w:r>
+            <w:fldChar w:fldCharType="end"/>
+          </w:r>
+        </w:p>
+        <w:p>
+          <w:pPr>
+            <w:pStyle w:val="12"/>
+            <w:tabs>
+              <w:tab w:val="right" w:leader="dot" w:pos="8787"/>
+            </w:tabs>
+          </w:pPr>
+          <w:r>
+            <w:fldChar w:fldCharType="begin"/>
+          </w:r>
+          <w:r>
+            <w:instrText xml:space="preserve"> HYPERLINK \l _Toc8050 </w:instrText>
+          </w:r>
+          <w:r>
+            <w:fldChar w:fldCharType="separate"/>
+          </w:r>
+          <w:r>
             <w:rPr>
-              <w:rFonts w:hint="eastAsia" w:ascii="宋体" w:hAnsi="宋体" w:eastAsia="宋体" w:cs="宋体"/>
+              <w:rFonts w:hint="default"/>
             </w:rPr>
-            <w:instrText xml:space="preserve"> HYPERLINK \l _Toc10357 </w:instrText>
+            <w:t xml:space="preserve">1.1.1.1.1.1 </w:t>
           </w:r>
           <w:r>
             <w:rPr>
-              <w:rFonts w:hint="eastAsia" w:ascii="宋体" w:hAnsi="宋体" w:eastAsia="宋体" w:cs="宋体"/>
+              <w:rFonts w:hint="eastAsia" w:cs="宋体"/>
+              <w:lang w:val="en-US" w:eastAsia="zh-CN"/>
             </w:rPr>
+            <w:t>KL六级标题</w:t>
+          </w:r>
+          <w:r>
+            <w:tab/>
+          </w:r>
+          <w:r>
+            <w:fldChar w:fldCharType="begin"/>
+          </w:r>
+          <w:r>
+            <w:instrText xml:space="preserve"> PAGEREF _Toc8050 \h </w:instrText>
+          </w:r>
+          <w:r>
             <w:fldChar w:fldCharType="separate"/>
           </w:r>
           <w:r>
+            <w:t>1</w:t>
+          </w:r>
+          <w:r>
+            <w:fldChar w:fldCharType="end"/>
+          </w:r>
+          <w:r>
+            <w:fldChar w:fldCharType="end"/>
+          </w:r>
+        </w:p>
+        <w:p>
+          <w:pPr>
+            <w:pStyle w:val="10"/>
+            <w:tabs>
+              <w:tab w:val="right" w:leader="dot" w:pos="8787"/>
+            </w:tabs>
+          </w:pPr>
+          <w:r>
+            <w:fldChar w:fldCharType="begin"/>
+          </w:r>
+          <w:r>
+            <w:instrText xml:space="preserve"> HYPERLINK \l _Toc3113 </w:instrText>
+          </w:r>
+          <w:r>
+            <w:fldChar w:fldCharType="separate"/>
+          </w:r>
+          <w:r>
             <w:rPr>
-              <w:rFonts w:hint="eastAsia" w:ascii="宋体" w:hAnsi="宋体" w:eastAsia="宋体" w:cs="宋体"/>
+              <w:rFonts w:hint="default" w:ascii="宋体" w:hAnsi="宋体" w:eastAsia="宋体" w:cs="宋体"/>
               <w:bCs/>
               <w:szCs w:val="24"/>
             </w:rPr>
-            <w:t xml:space="preserve">1.1 </w:t>
+            <w:t xml:space="preserve">2 </w:t>
+          </w:r>
+          <w:r>
+            <w:rPr>
+              <w:rFonts w:hint="eastAsia" w:ascii="宋体" w:hAnsi="宋体" w:eastAsia="宋体" w:cs="宋体"/>
+              <w:lang w:val="en-US" w:eastAsia="zh-CN"/>
+            </w:rPr>
+            <w:t>KL一级标题</w:t>
+          </w:r>
+          <w:r>
+            <w:tab/>
+          </w:r>
+          <w:r>
+            <w:fldChar w:fldCharType="begin"/>
+          </w:r>
+          <w:r>
+            <w:instrText xml:space="preserve"> PAGEREF _Toc3113 \h </w:instrText>
+          </w:r>
+          <w:r>
+            <w:fldChar w:fldCharType="separate"/>
+          </w:r>
+          <w:r>
+            <w:t>1</w:t>
+          </w:r>
+          <w:r>
+            <w:fldChar w:fldCharType="end"/>
+          </w:r>
+          <w:r>
+            <w:fldChar w:fldCharType="end"/>
+          </w:r>
+        </w:p>
+        <w:p>
+          <w:pPr>
+            <w:pStyle w:val="14"/>
+            <w:tabs>
+              <w:tab w:val="right" w:leader="dot" w:pos="8787"/>
+            </w:tabs>
+          </w:pPr>
+          <w:r>
+            <w:fldChar w:fldCharType="begin"/>
+          </w:r>
+          <w:r>
+            <w:instrText xml:space="preserve"> HYPERLINK \l _Toc23681 </w:instrText>
+          </w:r>
+          <w:r>
+            <w:fldChar w:fldCharType="separate"/>
+          </w:r>
+          <w:r>
+            <w:rPr>
+              <w:rFonts w:hint="default" w:ascii="宋体" w:hAnsi="宋体" w:eastAsia="宋体" w:cs="宋体"/>
+              <w:bCs/>
+              <w:szCs w:val="24"/>
+            </w:rPr>
+            <w:t xml:space="preserve">2.1 </w:t>
           </w:r>
           <w:r>
             <w:rPr>
@@ -1419,131 +1718,76 @@
             <w:t>KL二级标题</w:t>
           </w:r>
           <w:r>
-            <w:rPr>
-              <w:rFonts w:hint="eastAsia" w:ascii="宋体" w:hAnsi="宋体" w:eastAsia="宋体" w:cs="宋体"/>
-            </w:rPr>
             <w:tab/>
           </w:r>
           <w:r>
-            <w:rPr>
-              <w:rFonts w:hint="eastAsia" w:ascii="宋体" w:hAnsi="宋体" w:eastAsia="宋体" w:cs="宋体"/>
-            </w:rPr>
             <w:fldChar w:fldCharType="begin"/>
           </w:r>
           <w:r>
-            <w:rPr>
-              <w:rFonts w:hint="eastAsia" w:ascii="宋体" w:hAnsi="宋体" w:eastAsia="宋体" w:cs="宋体"/>
-            </w:rPr>
-            <w:instrText xml:space="preserve"> PAGEREF _Toc10357 \h </w:instrText>
-          </w:r>
-          <w:r>
-            <w:rPr>
-              <w:rFonts w:hint="eastAsia" w:ascii="宋体" w:hAnsi="宋体" w:eastAsia="宋体" w:cs="宋体"/>
-            </w:rPr>
+            <w:instrText xml:space="preserve"> PAGEREF _Toc23681 \h </w:instrText>
+          </w:r>
+          <w:r>
             <w:fldChar w:fldCharType="separate"/>
           </w:r>
           <w:r>
-            <w:rPr>
-              <w:rFonts w:hint="eastAsia" w:ascii="宋体" w:hAnsi="宋体" w:eastAsia="宋体" w:cs="宋体"/>
-            </w:rPr>
-            <w:t>8</w:t>
-          </w:r>
-          <w:r>
-            <w:rPr>
-              <w:rFonts w:hint="eastAsia" w:ascii="宋体" w:hAnsi="宋体" w:eastAsia="宋体" w:cs="宋体"/>
-            </w:rPr>
+            <w:t>1</w:t>
+          </w:r>
+          <w:r>
             <w:fldChar w:fldCharType="end"/>
           </w:r>
           <w:r>
-            <w:rPr>
-              <w:rFonts w:hint="eastAsia" w:ascii="宋体" w:hAnsi="宋体" w:eastAsia="宋体" w:cs="宋体"/>
-            </w:rPr>
             <w:fldChar w:fldCharType="end"/>
           </w:r>
         </w:p>
         <w:p>
           <w:pPr>
-            <w:pStyle w:val="9"/>
+            <w:pStyle w:val="7"/>
             <w:tabs>
               <w:tab w:val="right" w:leader="dot" w:pos="8787"/>
             </w:tabs>
+          </w:pPr>
+          <w:r>
+            <w:fldChar w:fldCharType="begin"/>
+          </w:r>
+          <w:r>
+            <w:instrText xml:space="preserve"> HYPERLINK \l _Toc19566 </w:instrText>
+          </w:r>
+          <w:r>
+            <w:fldChar w:fldCharType="separate"/>
+          </w:r>
+          <w:r>
             <w:rPr>
-              <w:rFonts w:hint="eastAsia" w:ascii="宋体" w:hAnsi="宋体" w:eastAsia="宋体" w:cs="宋体"/>
-            </w:rPr>
-          </w:pPr>
-          <w:r>
-            <w:rPr>
-              <w:rFonts w:hint="eastAsia" w:ascii="宋体" w:hAnsi="宋体" w:eastAsia="宋体" w:cs="宋体"/>
-            </w:rPr>
-            <w:fldChar w:fldCharType="begin"/>
-          </w:r>
-          <w:r>
-            <w:rPr>
-              <w:rFonts w:hint="eastAsia" w:ascii="宋体" w:hAnsi="宋体" w:eastAsia="宋体" w:cs="宋体"/>
-            </w:rPr>
-            <w:instrText xml:space="preserve"> HYPERLINK \l _Toc29659 </w:instrText>
-          </w:r>
-          <w:r>
-            <w:rPr>
-              <w:rFonts w:hint="eastAsia" w:ascii="宋体" w:hAnsi="宋体" w:eastAsia="宋体" w:cs="宋体"/>
-            </w:rPr>
-            <w:fldChar w:fldCharType="separate"/>
-          </w:r>
-          <w:r>
-            <w:rPr>
-              <w:rFonts w:hint="eastAsia" w:ascii="宋体" w:hAnsi="宋体" w:eastAsia="宋体" w:cs="宋体"/>
-              <w:bCs/>
+              <w:rFonts w:hint="default" w:ascii="宋体" w:hAnsi="宋体" w:eastAsia="宋体" w:cs="宋体"/>
               <w:szCs w:val="24"/>
             </w:rPr>
-            <w:t xml:space="preserve">2 </w:t>
+            <w:t xml:space="preserve">2.1.1 </w:t>
           </w:r>
           <w:r>
             <w:rPr>
               <w:rFonts w:hint="eastAsia" w:ascii="宋体" w:hAnsi="宋体" w:eastAsia="宋体" w:cs="宋体"/>
               <w:lang w:val="en-US" w:eastAsia="zh-CN"/>
             </w:rPr>
-            <w:t>KL一级标题</w:t>
-          </w:r>
-          <w:r>
-            <w:rPr>
-              <w:rFonts w:hint="eastAsia" w:ascii="宋体" w:hAnsi="宋体" w:eastAsia="宋体" w:cs="宋体"/>
-            </w:rPr>
+            <w:t>KL三级标题</w:t>
+          </w:r>
+          <w:r>
             <w:tab/>
           </w:r>
           <w:r>
-            <w:rPr>
-              <w:rFonts w:hint="eastAsia" w:ascii="宋体" w:hAnsi="宋体" w:eastAsia="宋体" w:cs="宋体"/>
-            </w:rPr>
             <w:fldChar w:fldCharType="begin"/>
           </w:r>
           <w:r>
-            <w:rPr>
-              <w:rFonts w:hint="eastAsia" w:ascii="宋体" w:hAnsi="宋体" w:eastAsia="宋体" w:cs="宋体"/>
-            </w:rPr>
-            <w:instrText xml:space="preserve"> PAGEREF _Toc29659 \h </w:instrText>
-          </w:r>
-          <w:r>
-            <w:rPr>
-              <w:rFonts w:hint="eastAsia" w:ascii="宋体" w:hAnsi="宋体" w:eastAsia="宋体" w:cs="宋体"/>
-            </w:rPr>
+            <w:instrText xml:space="preserve"> PAGEREF _Toc19566 \h </w:instrText>
+          </w:r>
+          <w:r>
             <w:fldChar w:fldCharType="separate"/>
           </w:r>
           <w:r>
-            <w:rPr>
-              <w:rFonts w:hint="eastAsia" w:ascii="宋体" w:hAnsi="宋体" w:eastAsia="宋体" w:cs="宋体"/>
-            </w:rPr>
-            <w:t>8</w:t>
-          </w:r>
-          <w:r>
-            <w:rPr>
-              <w:rFonts w:hint="eastAsia" w:ascii="宋体" w:hAnsi="宋体" w:eastAsia="宋体" w:cs="宋体"/>
-            </w:rPr>
+            <w:t>1</w:t>
+          </w:r>
+          <w:r>
             <w:fldChar w:fldCharType="end"/>
           </w:r>
           <w:r>
-            <w:rPr>
-              <w:rFonts w:hint="eastAsia" w:ascii="宋体" w:hAnsi="宋体" w:eastAsia="宋体" w:cs="宋体"/>
-            </w:rPr>
             <w:fldChar w:fldCharType="end"/>
           </w:r>
         </w:p>
@@ -1553,83 +1797,157 @@
             <w:tabs>
               <w:tab w:val="right" w:leader="dot" w:pos="8787"/>
             </w:tabs>
+          </w:pPr>
+          <w:r>
+            <w:fldChar w:fldCharType="begin"/>
+          </w:r>
+          <w:r>
+            <w:instrText xml:space="preserve"> HYPERLINK \l _Toc11385 </w:instrText>
+          </w:r>
+          <w:r>
+            <w:fldChar w:fldCharType="separate"/>
+          </w:r>
+          <w:r>
             <w:rPr>
-              <w:rFonts w:hint="eastAsia" w:ascii="宋体" w:hAnsi="宋体" w:eastAsia="宋体" w:cs="宋体"/>
+              <w:rFonts w:hint="default" w:ascii="宋体" w:hAnsi="宋体" w:eastAsia="宋体" w:cs="宋体"/>
             </w:rPr>
-          </w:pPr>
-          <w:r>
-            <w:rPr>
-              <w:rFonts w:hint="eastAsia" w:ascii="宋体" w:hAnsi="宋体" w:eastAsia="宋体" w:cs="宋体"/>
-            </w:rPr>
-            <w:fldChar w:fldCharType="begin"/>
-          </w:r>
-          <w:r>
-            <w:rPr>
-              <w:rFonts w:hint="eastAsia" w:ascii="宋体" w:hAnsi="宋体" w:eastAsia="宋体" w:cs="宋体"/>
-            </w:rPr>
-            <w:instrText xml:space="preserve"> HYPERLINK \l _Toc28147 </w:instrText>
-          </w:r>
-          <w:r>
-            <w:rPr>
-              <w:rFonts w:hint="eastAsia" w:ascii="宋体" w:hAnsi="宋体" w:eastAsia="宋体" w:cs="宋体"/>
-            </w:rPr>
-            <w:fldChar w:fldCharType="separate"/>
-          </w:r>
-          <w:r>
-            <w:rPr>
-              <w:rFonts w:hint="eastAsia" w:ascii="宋体" w:hAnsi="宋体" w:eastAsia="宋体" w:cs="宋体"/>
-              <w:bCs/>
-              <w:szCs w:val="24"/>
-            </w:rPr>
-            <w:t xml:space="preserve">2.1 </w:t>
+            <w:t xml:space="preserve">1.1.1.1 </w:t>
           </w:r>
           <w:r>
             <w:rPr>
               <w:rFonts w:hint="eastAsia" w:ascii="宋体" w:hAnsi="宋体" w:eastAsia="宋体" w:cs="宋体"/>
               <w:lang w:val="en-US" w:eastAsia="zh-CN"/>
             </w:rPr>
-            <w:t>KL二级标题</w:t>
+            <w:t>KL</w:t>
           </w:r>
           <w:r>
             <w:rPr>
-              <w:rFonts w:hint="eastAsia" w:ascii="宋体" w:hAnsi="宋体" w:eastAsia="宋体" w:cs="宋体"/>
+              <w:rFonts w:hint="eastAsia" w:cs="宋体"/>
+              <w:lang w:val="en-US" w:eastAsia="zh-CN"/>
             </w:rPr>
+            <w:t>四级标题</w:t>
+          </w:r>
+          <w:r>
             <w:tab/>
           </w:r>
           <w:r>
+            <w:fldChar w:fldCharType="begin"/>
+          </w:r>
+          <w:r>
+            <w:instrText xml:space="preserve"> PAGEREF _Toc11385 \h </w:instrText>
+          </w:r>
+          <w:r>
+            <w:fldChar w:fldCharType="separate"/>
+          </w:r>
+          <w:r>
+            <w:t>1</w:t>
+          </w:r>
+          <w:r>
+            <w:fldChar w:fldCharType="end"/>
+          </w:r>
+          <w:r>
+            <w:fldChar w:fldCharType="end"/>
+          </w:r>
+        </w:p>
+        <w:p>
+          <w:pPr>
+            <w:pStyle w:val="6"/>
+            <w:tabs>
+              <w:tab w:val="right" w:leader="dot" w:pos="8787"/>
+            </w:tabs>
+          </w:pPr>
+          <w:r>
+            <w:fldChar w:fldCharType="begin"/>
+          </w:r>
+          <w:r>
+            <w:instrText xml:space="preserve"> HYPERLINK \l _Toc17621 </w:instrText>
+          </w:r>
+          <w:r>
+            <w:fldChar w:fldCharType="separate"/>
+          </w:r>
+          <w:r>
             <w:rPr>
-              <w:rFonts w:hint="eastAsia" w:ascii="宋体" w:hAnsi="宋体" w:eastAsia="宋体" w:cs="宋体"/>
+              <w:rFonts w:hint="default"/>
             </w:rPr>
+            <w:t xml:space="preserve">1.1.1.1.1 </w:t>
+          </w:r>
+          <w:r>
+            <w:rPr>
+              <w:rFonts w:hint="eastAsia" w:cs="宋体"/>
+              <w:lang w:val="en-US" w:eastAsia="zh-CN"/>
+            </w:rPr>
+            <w:t>KL五级标题</w:t>
+          </w:r>
+          <w:r>
+            <w:tab/>
+          </w:r>
+          <w:r>
             <w:fldChar w:fldCharType="begin"/>
           </w:r>
           <w:r>
+            <w:instrText xml:space="preserve"> PAGEREF _Toc17621 \h </w:instrText>
+          </w:r>
+          <w:r>
+            <w:fldChar w:fldCharType="separate"/>
+          </w:r>
+          <w:r>
+            <w:t>1</w:t>
+          </w:r>
+          <w:r>
+            <w:fldChar w:fldCharType="end"/>
+          </w:r>
+          <w:r>
+            <w:fldChar w:fldCharType="end"/>
+          </w:r>
+        </w:p>
+        <w:p>
+          <w:pPr>
+            <w:pStyle w:val="12"/>
+            <w:tabs>
+              <w:tab w:val="right" w:leader="dot" w:pos="8787"/>
+            </w:tabs>
+          </w:pPr>
+          <w:r>
+            <w:fldChar w:fldCharType="begin"/>
+          </w:r>
+          <w:r>
+            <w:instrText xml:space="preserve"> HYPERLINK \l _Toc14970 </w:instrText>
+          </w:r>
+          <w:r>
+            <w:fldChar w:fldCharType="separate"/>
+          </w:r>
+          <w:r>
             <w:rPr>
-              <w:rFonts w:hint="eastAsia" w:ascii="宋体" w:hAnsi="宋体" w:eastAsia="宋体" w:cs="宋体"/>
+              <w:rFonts w:hint="default"/>
             </w:rPr>
-            <w:instrText xml:space="preserve"> PAGEREF _Toc28147 \h </w:instrText>
+            <w:t xml:space="preserve">2.1.1.1.1.1 </w:t>
           </w:r>
           <w:r>
             <w:rPr>
-              <w:rFonts w:hint="eastAsia" w:ascii="宋体" w:hAnsi="宋体" w:eastAsia="宋体" w:cs="宋体"/>
+              <w:rFonts w:hint="eastAsia" w:cs="宋体"/>
+              <w:lang w:val="en-US" w:eastAsia="zh-CN"/>
             </w:rPr>
+            <w:t>KL六级标题</w:t>
+          </w:r>
+          <w:r>
+            <w:tab/>
+          </w:r>
+          <w:r>
+            <w:fldChar w:fldCharType="begin"/>
+          </w:r>
+          <w:r>
+            <w:instrText xml:space="preserve"> PAGEREF _Toc14970 \h </w:instrText>
+          </w:r>
+          <w:r>
             <w:fldChar w:fldCharType="separate"/>
           </w:r>
           <w:r>
-            <w:rPr>
-              <w:rFonts w:hint="eastAsia" w:ascii="宋体" w:hAnsi="宋体" w:eastAsia="宋体" w:cs="宋体"/>
-            </w:rPr>
-            <w:t>8</w:t>
-          </w:r>
-          <w:r>
-            <w:rPr>
-              <w:rFonts w:hint="eastAsia" w:ascii="宋体" w:hAnsi="宋体" w:eastAsia="宋体" w:cs="宋体"/>
-            </w:rPr>
+            <w:t>1</w:t>
+          </w:r>
+          <w:r>
             <w:fldChar w:fldCharType="end"/>
           </w:r>
           <w:r>
-            <w:rPr>
-              <w:rFonts w:hint="eastAsia" w:ascii="宋体" w:hAnsi="宋体" w:eastAsia="宋体" w:cs="宋体"/>
-            </w:rPr>
             <w:fldChar w:fldCharType="end"/>
           </w:r>
         </w:p>
@@ -1637,12 +1955,14 @@
           <w:pPr>
             <w:rPr>
               <w:rFonts w:hint="eastAsia" w:ascii="宋体" w:hAnsi="宋体" w:eastAsia="宋体" w:cs="宋体"/>
+              <w:color w:val="000000"/>
+              <w:kern w:val="2"/>
+              <w:sz w:val="24"/>
+              <w:szCs w:val="28"/>
+              <w:lang w:val="en-US" w:eastAsia="zh-CN" w:bidi="ar-SA"/>
             </w:rPr>
           </w:pPr>
           <w:r>
-            <w:rPr>
-              <w:rFonts w:hint="eastAsia" w:ascii="宋体" w:hAnsi="宋体" w:eastAsia="宋体" w:cs="宋体"/>
-            </w:rPr>
             <w:fldChar w:fldCharType="end"/>
           </w:r>
         </w:p>
@@ -1650,19 +1970,15 @@
     </w:sdt>
     <w:p>
       <w:pPr>
-        <w:pStyle w:val="10"/>
-        <w:tabs>
-          <w:tab w:val="right" w:leader="dot" w:pos="8296"/>
-        </w:tabs>
-        <w:spacing w:line="360" w:lineRule="auto"/>
-        <w:ind w:left="562" w:leftChars="0" w:hanging="562"/>
-        <w:jc w:val="center"/>
-        <w:rPr>
-          <w:rFonts w:hint="eastAsia" w:ascii="宋体" w:hAnsi="宋体" w:eastAsia="宋体" w:cs="宋体"/>
-          <w:b/>
-          <w:color w:val="000000"/>
-          <w:sz w:val="28"/>
-          <w:szCs w:val="28"/>
+        <w:rPr>
+          <w:rFonts w:hint="eastAsia"/>
+        </w:rPr>
+      </w:pPr>
+    </w:p>
+    <w:p>
+      <w:pPr>
+        <w:rPr>
+          <w:rFonts w:hint="eastAsia"/>
         </w:rPr>
         <w:sectPr>
           <w:footerReference r:id="rId12" w:type="default"/>
@@ -1676,41 +1992,39 @@
     </w:p>
     <w:p>
       <w:pPr>
-        <w:pStyle w:val="10"/>
-        <w:tabs>
-          <w:tab w:val="right" w:leader="dot" w:pos="8296"/>
-        </w:tabs>
-        <w:spacing w:line="360" w:lineRule="auto"/>
-        <w:ind w:left="562" w:leftChars="0" w:hanging="562"/>
-        <w:jc w:val="center"/>
+        <w:pStyle w:val="44"/>
+        <w:bidi w:val="0"/>
         <w:rPr>
           <w:rFonts w:hint="eastAsia" w:ascii="宋体" w:hAnsi="宋体" w:eastAsia="宋体" w:cs="宋体"/>
           <w:b/>
           <w:color w:val="000000"/>
-          <w:sz w:val="28"/>
           <w:szCs w:val="28"/>
         </w:rPr>
       </w:pPr>
       <w:r>
         <w:rPr>
-          <w:rFonts w:hint="eastAsia" w:ascii="宋体" w:hAnsi="宋体" w:eastAsia="宋体" w:cs="宋体"/>
-          <w:b/>
-          <w:color w:val="000000"/>
-          <w:sz w:val="28"/>
-          <w:szCs w:val="28"/>
-        </w:rPr>
-        <w:t>图 录</w:t>
+          <w:rFonts w:hint="eastAsia"/>
+        </w:rPr>
+        <w:t>图</w:t>
+      </w:r>
+      <w:r>
+        <w:rPr>
+          <w:rFonts w:hint="eastAsia"/>
+          <w:lang w:val="en-US" w:eastAsia="zh-CN"/>
+        </w:rPr>
+        <w:t xml:space="preserve"> </w:t>
+      </w:r>
+      <w:r>
+        <w:rPr>
+          <w:rFonts w:hint="eastAsia"/>
+        </w:rPr>
+        <w:t>录</w:t>
       </w:r>
     </w:p>
     <w:p>
       <w:pPr>
-        <w:pStyle w:val="10"/>
-        <w:tabs>
-          <w:tab w:val="right" w:leader="dot" w:pos="8787"/>
-        </w:tabs>
-        <w:rPr>
-          <w:rFonts w:hint="eastAsia" w:ascii="宋体" w:hAnsi="宋体" w:eastAsia="宋体" w:cs="宋体"/>
-        </w:rPr>
+        <w:pStyle w:val="13"/>
+        <w:bidi w:val="0"/>
       </w:pPr>
       <w:r>
         <w:rPr>
@@ -1747,7 +2061,7 @@
         <w:rPr>
           <w:rFonts w:hint="eastAsia" w:ascii="宋体" w:hAnsi="宋体" w:eastAsia="宋体" w:cs="宋体"/>
         </w:rPr>
-        <w:instrText xml:space="preserve"> HYPERLINK \l _Toc31056 </w:instrText>
+        <w:instrText xml:space="preserve"> HYPERLINK \l _Toc1384 </w:instrText>
       </w:r>
       <w:r>
         <w:rPr>
@@ -1763,9 +2077,6 @@
         <w:t>1-</w:t>
       </w:r>
       <w:r>
-        <w:rPr>
-          <w:rFonts w:hint="eastAsia" w:ascii="宋体" w:hAnsi="宋体" w:eastAsia="宋体" w:cs="宋体"/>
-        </w:rPr>
         <w:t xml:space="preserve">1 </w:t>
       </w:r>
       <w:r>
@@ -1776,39 +2087,21 @@
         <w:t>图注1</w:t>
       </w:r>
       <w:r>
-        <w:rPr>
-          <w:rFonts w:hint="eastAsia" w:ascii="宋体" w:hAnsi="宋体" w:eastAsia="宋体" w:cs="宋体"/>
-        </w:rPr>
         <w:tab/>
       </w:r>
       <w:r>
-        <w:rPr>
-          <w:rFonts w:hint="eastAsia" w:ascii="宋体" w:hAnsi="宋体" w:eastAsia="宋体" w:cs="宋体"/>
-        </w:rPr>
         <w:fldChar w:fldCharType="begin"/>
       </w:r>
       <w:r>
-        <w:rPr>
-          <w:rFonts w:hint="eastAsia" w:ascii="宋体" w:hAnsi="宋体" w:eastAsia="宋体" w:cs="宋体"/>
-        </w:rPr>
-        <w:instrText xml:space="preserve"> PAGEREF _Toc31056 \h </w:instrText>
-      </w:r>
-      <w:r>
-        <w:rPr>
-          <w:rFonts w:hint="eastAsia" w:ascii="宋体" w:hAnsi="宋体" w:eastAsia="宋体" w:cs="宋体"/>
-        </w:rPr>
+        <w:instrText xml:space="preserve"> PAGEREF _Toc1384 \h </w:instrText>
+      </w:r>
+      <w:r>
         <w:fldChar w:fldCharType="separate"/>
       </w:r>
       <w:r>
-        <w:rPr>
-          <w:rFonts w:hint="eastAsia" w:ascii="宋体" w:hAnsi="宋体" w:eastAsia="宋体" w:cs="宋体"/>
-        </w:rPr>
-        <w:t>8</w:t>
-      </w:r>
-      <w:r>
-        <w:rPr>
-          <w:rFonts w:hint="eastAsia" w:ascii="宋体" w:hAnsi="宋体" w:eastAsia="宋体" w:cs="宋体"/>
-        </w:rPr>
+        <w:t>1</w:t>
+      </w:r>
+      <w:r>
         <w:fldChar w:fldCharType="end"/>
       </w:r>
       <w:r>
@@ -1821,13 +2114,7 @@
     </w:p>
     <w:p>
       <w:pPr>
-        <w:pStyle w:val="10"/>
-        <w:tabs>
-          <w:tab w:val="right" w:leader="dot" w:pos="8787"/>
-        </w:tabs>
-        <w:rPr>
-          <w:rFonts w:hint="eastAsia" w:ascii="宋体" w:hAnsi="宋体" w:eastAsia="宋体" w:cs="宋体"/>
-        </w:rPr>
+        <w:pStyle w:val="13"/>
       </w:pPr>
       <w:r>
         <w:rPr>
@@ -1840,7 +2127,7 @@
         <w:rPr>
           <w:rFonts w:hint="eastAsia" w:ascii="宋体" w:hAnsi="宋体" w:eastAsia="宋体" w:cs="宋体"/>
         </w:rPr>
-        <w:instrText xml:space="preserve"> HYPERLINK \l _Toc4627 </w:instrText>
+        <w:instrText xml:space="preserve"> HYPERLINK \l _Toc31190 </w:instrText>
       </w:r>
       <w:r>
         <w:rPr>
@@ -1856,10 +2143,7 @@
         <w:t>2-</w:t>
       </w:r>
       <w:r>
-        <w:rPr>
-          <w:rFonts w:hint="eastAsia" w:ascii="宋体" w:hAnsi="宋体" w:eastAsia="宋体" w:cs="宋体"/>
-        </w:rPr>
-        <w:t xml:space="preserve">2 </w:t>
+        <w:t xml:space="preserve">1 </w:t>
       </w:r>
       <w:r>
         <w:rPr>
@@ -1869,39 +2153,21 @@
         <w:t>图注2</w:t>
       </w:r>
       <w:r>
-        <w:rPr>
-          <w:rFonts w:hint="eastAsia" w:ascii="宋体" w:hAnsi="宋体" w:eastAsia="宋体" w:cs="宋体"/>
-        </w:rPr>
         <w:tab/>
       </w:r>
       <w:r>
-        <w:rPr>
-          <w:rFonts w:hint="eastAsia" w:ascii="宋体" w:hAnsi="宋体" w:eastAsia="宋体" w:cs="宋体"/>
-        </w:rPr>
         <w:fldChar w:fldCharType="begin"/>
       </w:r>
       <w:r>
-        <w:rPr>
-          <w:rFonts w:hint="eastAsia" w:ascii="宋体" w:hAnsi="宋体" w:eastAsia="宋体" w:cs="宋体"/>
-        </w:rPr>
-        <w:instrText xml:space="preserve"> PAGEREF _Toc4627 \h </w:instrText>
-      </w:r>
-      <w:r>
-        <w:rPr>
-          <w:rFonts w:hint="eastAsia" w:ascii="宋体" w:hAnsi="宋体" w:eastAsia="宋体" w:cs="宋体"/>
-        </w:rPr>
+        <w:instrText xml:space="preserve"> PAGEREF _Toc31190 \h </w:instrText>
+      </w:r>
+      <w:r>
         <w:fldChar w:fldCharType="separate"/>
       </w:r>
       <w:r>
-        <w:rPr>
-          <w:rFonts w:hint="eastAsia" w:ascii="宋体" w:hAnsi="宋体" w:eastAsia="宋体" w:cs="宋体"/>
-        </w:rPr>
-        <w:t>8</w:t>
-      </w:r>
-      <w:r>
-        <w:rPr>
-          <w:rFonts w:hint="eastAsia" w:ascii="宋体" w:hAnsi="宋体" w:eastAsia="宋体" w:cs="宋体"/>
-        </w:rPr>
+        <w:t>1</w:t>
+      </w:r>
+      <w:r>
         <w:fldChar w:fldCharType="end"/>
       </w:r>
       <w:r>
@@ -1914,9 +2180,10 @@
     </w:p>
     <w:p>
       <w:pPr>
-        <w:pStyle w:val="10"/>
+        <w:pStyle w:val="13"/>
         <w:tabs>
           <w:tab w:val="right" w:leader="dot" w:pos="8683"/>
+          <w:tab w:val="clear" w:pos="8787"/>
         </w:tabs>
         <w:spacing w:line="360" w:lineRule="auto"/>
         <w:ind w:left="0" w:leftChars="0" w:firstLine="0" w:firstLineChars="0"/>
@@ -1957,38 +2224,41 @@
     </w:p>
     <w:p>
       <w:pPr>
-        <w:pStyle w:val="10"/>
-        <w:tabs>
-          <w:tab w:val="right" w:leader="dot" w:pos="8296"/>
-        </w:tabs>
-        <w:spacing w:line="360" w:lineRule="auto"/>
-        <w:ind w:left="562" w:leftChars="0" w:hanging="562"/>
-        <w:jc w:val="center"/>
+        <w:pStyle w:val="44"/>
+        <w:bidi w:val="0"/>
         <w:rPr>
           <w:rFonts w:hint="eastAsia" w:ascii="宋体" w:hAnsi="宋体" w:eastAsia="宋体" w:cs="宋体"/>
           <w:b/>
           <w:color w:val="000000"/>
-          <w:sz w:val="28"/>
           <w:szCs w:val="28"/>
         </w:rPr>
       </w:pPr>
       <w:r>
         <w:rPr>
-          <w:rFonts w:hint="eastAsia" w:ascii="宋体" w:hAnsi="宋体" w:eastAsia="宋体" w:cs="宋体"/>
-          <w:b/>
-          <w:color w:val="000000"/>
-          <w:sz w:val="28"/>
-          <w:szCs w:val="28"/>
-        </w:rPr>
-        <w:t>表录</w:t>
+          <w:rFonts w:hint="eastAsia"/>
+        </w:rPr>
+        <w:t>表</w:t>
+      </w:r>
+      <w:r>
+        <w:rPr>
+          <w:rFonts w:hint="eastAsia"/>
+          <w:lang w:val="en-US" w:eastAsia="zh-CN"/>
+        </w:rPr>
+        <w:t xml:space="preserve"> </w:t>
+      </w:r>
+      <w:r>
+        <w:rPr>
+          <w:rFonts w:hint="eastAsia"/>
+        </w:rPr>
+        <w:t>录</w:t>
       </w:r>
     </w:p>
     <w:p>
       <w:pPr>
-        <w:pStyle w:val="10"/>
-        <w:tabs>
-          <w:tab w:val="right" w:leader="dot" w:pos="8787"/>
-        </w:tabs>
+        <w:pStyle w:val="13"/>
+        <w:rPr>
+          <w:rFonts w:hint="eastAsia" w:ascii="宋体" w:hAnsi="宋体" w:eastAsia="宋体" w:cs="宋体"/>
+        </w:rPr>
       </w:pPr>
       <w:r>
         <w:rPr>
@@ -2025,7 +2295,7 @@
         <w:rPr>
           <w:rFonts w:hint="eastAsia" w:ascii="宋体" w:hAnsi="宋体" w:eastAsia="宋体" w:cs="宋体"/>
         </w:rPr>
-        <w:instrText xml:space="preserve"> HYPERLINK \l _Toc16021 </w:instrText>
+        <w:instrText xml:space="preserve"> HYPERLINK \l _Toc7336 </w:instrText>
       </w:r>
       <w:r>
         <w:rPr>
@@ -2041,6 +2311,9 @@
         <w:t>1-</w:t>
       </w:r>
       <w:r>
+        <w:rPr>
+          <w:rFonts w:hint="eastAsia" w:ascii="宋体" w:hAnsi="宋体" w:eastAsia="宋体" w:cs="宋体"/>
+        </w:rPr>
         <w:t xml:space="preserve">1 </w:t>
       </w:r>
       <w:r>
@@ -2051,21 +2324,39 @@
         <w:t>表注1</w:t>
       </w:r>
       <w:r>
+        <w:rPr>
+          <w:rFonts w:hint="eastAsia" w:ascii="宋体" w:hAnsi="宋体" w:eastAsia="宋体" w:cs="宋体"/>
+        </w:rPr>
         <w:tab/>
       </w:r>
       <w:r>
+        <w:rPr>
+          <w:rFonts w:hint="eastAsia" w:ascii="宋体" w:hAnsi="宋体" w:eastAsia="宋体" w:cs="宋体"/>
+        </w:rPr>
         <w:fldChar w:fldCharType="begin"/>
       </w:r>
       <w:r>
-        <w:instrText xml:space="preserve"> PAGEREF _Toc16021 \h </w:instrText>
-      </w:r>
-      <w:r>
+        <w:rPr>
+          <w:rFonts w:hint="eastAsia" w:ascii="宋体" w:hAnsi="宋体" w:eastAsia="宋体" w:cs="宋体"/>
+        </w:rPr>
+        <w:instrText xml:space="preserve"> PAGEREF _Toc7336 \h </w:instrText>
+      </w:r>
+      <w:r>
+        <w:rPr>
+          <w:rFonts w:hint="eastAsia" w:ascii="宋体" w:hAnsi="宋体" w:eastAsia="宋体" w:cs="宋体"/>
+        </w:rPr>
         <w:fldChar w:fldCharType="separate"/>
       </w:r>
       <w:r>
-        <w:t>8</w:t>
-      </w:r>
-      <w:r>
+        <w:rPr>
+          <w:rFonts w:hint="eastAsia" w:ascii="宋体" w:hAnsi="宋体" w:eastAsia="宋体" w:cs="宋体"/>
+        </w:rPr>
+        <w:t>1</w:t>
+      </w:r>
+      <w:r>
+        <w:rPr>
+          <w:rFonts w:hint="eastAsia" w:ascii="宋体" w:hAnsi="宋体" w:eastAsia="宋体" w:cs="宋体"/>
+        </w:rPr>
         <w:fldChar w:fldCharType="end"/>
       </w:r>
       <w:r>
@@ -2078,10 +2369,10 @@
     </w:p>
     <w:p>
       <w:pPr>
-        <w:pStyle w:val="10"/>
-        <w:tabs>
-          <w:tab w:val="right" w:leader="dot" w:pos="8787"/>
-        </w:tabs>
+        <w:pStyle w:val="13"/>
+        <w:rPr>
+          <w:rFonts w:hint="eastAsia" w:ascii="宋体" w:hAnsi="宋体" w:eastAsia="宋体" w:cs="宋体"/>
+        </w:rPr>
       </w:pPr>
       <w:r>
         <w:rPr>
@@ -2096,7 +2387,7 @@
           <w:rFonts w:hint="eastAsia" w:ascii="宋体" w:hAnsi="宋体" w:eastAsia="宋体" w:cs="宋体"/>
           <w:szCs w:val="24"/>
         </w:rPr>
-        <w:instrText xml:space="preserve"> HYPERLINK \l _Toc8473 </w:instrText>
+        <w:instrText xml:space="preserve"> HYPERLINK \l _Toc29157 </w:instrText>
       </w:r>
       <w:r>
         <w:rPr>
@@ -2113,6 +2404,9 @@
         <w:t>2-</w:t>
       </w:r>
       <w:r>
+        <w:rPr>
+          <w:rFonts w:hint="eastAsia" w:ascii="宋体" w:hAnsi="宋体" w:eastAsia="宋体" w:cs="宋体"/>
+        </w:rPr>
         <w:t xml:space="preserve">1 </w:t>
       </w:r>
       <w:r>
@@ -2123,21 +2417,39 @@
         <w:t>表注2</w:t>
       </w:r>
       <w:r>
+        <w:rPr>
+          <w:rFonts w:hint="eastAsia" w:ascii="宋体" w:hAnsi="宋体" w:eastAsia="宋体" w:cs="宋体"/>
+        </w:rPr>
         <w:tab/>
       </w:r>
       <w:r>
+        <w:rPr>
+          <w:rFonts w:hint="eastAsia" w:ascii="宋体" w:hAnsi="宋体" w:eastAsia="宋体" w:cs="宋体"/>
+        </w:rPr>
         <w:fldChar w:fldCharType="begin"/>
       </w:r>
       <w:r>
-        <w:instrText xml:space="preserve"> PAGEREF _Toc8473 \h </w:instrText>
-      </w:r>
-      <w:r>
+        <w:rPr>
+          <w:rFonts w:hint="eastAsia" w:ascii="宋体" w:hAnsi="宋体" w:eastAsia="宋体" w:cs="宋体"/>
+        </w:rPr>
+        <w:instrText xml:space="preserve"> PAGEREF _Toc29157 \h </w:instrText>
+      </w:r>
+      <w:r>
+        <w:rPr>
+          <w:rFonts w:hint="eastAsia" w:ascii="宋体" w:hAnsi="宋体" w:eastAsia="宋体" w:cs="宋体"/>
+        </w:rPr>
         <w:fldChar w:fldCharType="separate"/>
       </w:r>
       <w:r>
-        <w:t>8</w:t>
-      </w:r>
-      <w:r>
+        <w:rPr>
+          <w:rFonts w:hint="eastAsia" w:ascii="宋体" w:hAnsi="宋体" w:eastAsia="宋体" w:cs="宋体"/>
+        </w:rPr>
+        <w:t>1</w:t>
+      </w:r>
+      <w:r>
+        <w:rPr>
+          <w:rFonts w:hint="eastAsia" w:ascii="宋体" w:hAnsi="宋体" w:eastAsia="宋体" w:cs="宋体"/>
+        </w:rPr>
         <w:fldChar w:fldCharType="end"/>
       </w:r>
       <w:r>
@@ -2206,7 +2518,7 @@
     </w:p>
     <w:p>
       <w:pPr>
-        <w:pStyle w:val="24"/>
+        <w:pStyle w:val="27"/>
         <w:keepNext w:val="0"/>
         <w:keepLines w:val="0"/>
         <w:pageBreakBefore w:val="0"/>
@@ -2226,7 +2538,8 @@
           <w:rFonts w:hint="eastAsia" w:ascii="宋体" w:hAnsi="宋体" w:eastAsia="宋体" w:cs="宋体"/>
         </w:rPr>
       </w:pPr>
-      <w:bookmarkStart w:id="0" w:name="_Toc10024"/>
+      <w:bookmarkStart w:id="0" w:name="_Toc32099"/>
+      <w:bookmarkStart w:id="1" w:name="_Toc22766"/>
       <w:r>
         <w:rPr>
           <w:rFonts w:hint="eastAsia" w:ascii="宋体" w:hAnsi="宋体" w:eastAsia="宋体" w:cs="宋体"/>
@@ -2235,10 +2548,11 @@
         <w:t>KL一级标题</w:t>
       </w:r>
       <w:bookmarkEnd w:id="0"/>
+      <w:bookmarkEnd w:id="1"/>
     </w:p>
     <w:p>
       <w:pPr>
-        <w:pStyle w:val="25"/>
+        <w:pStyle w:val="28"/>
         <w:keepNext w:val="0"/>
         <w:keepLines w:val="0"/>
         <w:pageBreakBefore w:val="0"/>
@@ -2259,7 +2573,8 @@
           <w:rFonts w:hint="eastAsia" w:ascii="宋体" w:hAnsi="宋体" w:eastAsia="宋体" w:cs="宋体"/>
         </w:rPr>
       </w:pPr>
-      <w:bookmarkStart w:id="1" w:name="_Toc10357"/>
+      <w:bookmarkStart w:id="2" w:name="_Toc21864"/>
+      <w:bookmarkStart w:id="3" w:name="_Toc14165"/>
       <w:r>
         <w:rPr>
           <w:rFonts w:hint="eastAsia" w:ascii="宋体" w:hAnsi="宋体" w:eastAsia="宋体" w:cs="宋体"/>
@@ -2267,11 +2582,12 @@
         </w:rPr>
         <w:t>KL二级标题</w:t>
       </w:r>
-      <w:bookmarkEnd w:id="1"/>
+      <w:bookmarkEnd w:id="2"/>
+      <w:bookmarkEnd w:id="3"/>
     </w:p>
     <w:p>
       <w:pPr>
-        <w:pStyle w:val="26"/>
+        <w:pStyle w:val="29"/>
         <w:keepNext w:val="0"/>
         <w:keepLines w:val="0"/>
         <w:pageBreakBefore w:val="0"/>
@@ -2291,6 +2607,8 @@
           <w:rFonts w:hint="eastAsia" w:ascii="宋体" w:hAnsi="宋体" w:eastAsia="宋体" w:cs="宋体"/>
         </w:rPr>
       </w:pPr>
+      <w:bookmarkStart w:id="4" w:name="_Toc29459"/>
+      <w:bookmarkStart w:id="5" w:name="_Toc22193"/>
       <w:r>
         <w:rPr>
           <w:rFonts w:hint="eastAsia" w:ascii="宋体" w:hAnsi="宋体" w:eastAsia="宋体" w:cs="宋体"/>
@@ -2298,29 +2616,72 @@
         </w:rPr>
         <w:t>KL三级标题</w:t>
       </w:r>
+      <w:bookmarkEnd w:id="4"/>
+      <w:bookmarkEnd w:id="5"/>
     </w:p>
     <w:p>
       <w:pPr>
-        <w:pStyle w:val="27"/>
+        <w:pStyle w:val="30"/>
         <w:bidi w:val="0"/>
         <w:ind w:left="0" w:leftChars="0" w:firstLine="0" w:firstLineChars="0"/>
         <w:rPr>
           <w:rFonts w:hint="eastAsia" w:ascii="宋体" w:hAnsi="宋体" w:eastAsia="宋体" w:cs="宋体"/>
         </w:rPr>
       </w:pPr>
-      <w:r>
-        <w:rPr>
-          <w:rFonts w:hint="eastAsia" w:ascii="宋体" w:hAnsi="宋体" w:eastAsia="宋体" w:cs="宋体"/>
-          <w:lang w:val="en-US" w:eastAsia="zh-CN"/>
-        </w:rPr>
-        <w:t>KL其他标题</w:t>
-      </w:r>
-      <w:bookmarkStart w:id="8" w:name="_GoBack"/>
+      <w:bookmarkStart w:id="6" w:name="_Toc8986"/>
+      <w:r>
+        <w:rPr>
+          <w:rFonts w:hint="eastAsia" w:ascii="宋体" w:hAnsi="宋体" w:eastAsia="宋体" w:cs="宋体"/>
+          <w:lang w:val="en-US" w:eastAsia="zh-CN"/>
+        </w:rPr>
+        <w:t>KL</w:t>
+      </w:r>
+      <w:r>
+        <w:rPr>
+          <w:rFonts w:hint="eastAsia" w:cs="宋体"/>
+          <w:lang w:val="en-US" w:eastAsia="zh-CN"/>
+        </w:rPr>
+        <w:t>四级标题</w:t>
+      </w:r>
+      <w:bookmarkEnd w:id="6"/>
+    </w:p>
+    <w:p>
+      <w:pPr>
+        <w:pStyle w:val="31"/>
+        <w:rPr>
+          <w:rFonts w:hint="eastAsia"/>
+        </w:rPr>
+      </w:pPr>
+      <w:bookmarkStart w:id="7" w:name="_Toc28628"/>
+      <w:r>
+        <w:rPr>
+          <w:rFonts w:hint="eastAsia" w:cs="宋体"/>
+          <w:lang w:val="en-US" w:eastAsia="zh-CN"/>
+        </w:rPr>
+        <w:t>KL五级标题</w:t>
+      </w:r>
+      <w:bookmarkEnd w:id="7"/>
+    </w:p>
+    <w:p>
+      <w:pPr>
+        <w:pStyle w:val="32"/>
+        <w:rPr>
+          <w:rFonts w:hint="eastAsia"/>
+        </w:rPr>
+      </w:pPr>
+      <w:bookmarkStart w:id="8" w:name="_Toc8050"/>
+      <w:r>
+        <w:rPr>
+          <w:rFonts w:hint="eastAsia" w:cs="宋体"/>
+          <w:lang w:val="en-US" w:eastAsia="zh-CN"/>
+        </w:rPr>
+        <w:t>KL六级标题</w:t>
+      </w:r>
       <w:bookmarkEnd w:id="8"/>
     </w:p>
     <w:p>
       <w:pPr>
-        <w:pStyle w:val="28"/>
+        <w:pStyle w:val="33"/>
         <w:bidi w:val="0"/>
         <w:rPr>
           <w:rFonts w:hint="eastAsia" w:ascii="宋体" w:hAnsi="宋体" w:eastAsia="宋体" w:cs="宋体"/>
@@ -2341,10 +2702,12 @@
         </w:rPr>
         <w:tab/>
       </w:r>
+      <w:bookmarkStart w:id="22" w:name="_GoBack"/>
+      <w:bookmarkEnd w:id="22"/>
     </w:p>
     <w:p>
       <w:pPr>
-        <w:pStyle w:val="28"/>
+        <w:pStyle w:val="33"/>
         <w:bidi w:val="0"/>
         <w:ind w:left="0" w:leftChars="0" w:firstLine="0" w:firstLineChars="0"/>
         <w:rPr>
@@ -2355,7 +2718,7 @@
     </w:p>
     <w:p>
       <w:pPr>
-        <w:pStyle w:val="31"/>
+        <w:pStyle w:val="36"/>
         <w:bidi w:val="0"/>
         <w:rPr>
           <w:rFonts w:hint="eastAsia" w:ascii="宋体" w:hAnsi="宋体" w:eastAsia="宋体" w:cs="宋体"/>
@@ -2439,7 +2802,7 @@
         </w:rPr>
         <w:fldChar w:fldCharType="end"/>
       </w:r>
-      <w:bookmarkStart w:id="2" w:name="_Toc16021"/>
+      <w:bookmarkStart w:id="9" w:name="_Toc7336"/>
       <w:r>
         <w:rPr>
           <w:rFonts w:hint="eastAsia" w:ascii="宋体" w:hAnsi="宋体" w:eastAsia="宋体" w:cs="宋体"/>
@@ -2447,11 +2810,11 @@
         </w:rPr>
         <w:t>表注1</w:t>
       </w:r>
-      <w:bookmarkEnd w:id="2"/>
+      <w:bookmarkEnd w:id="9"/>
     </w:p>
     <w:tbl>
       <w:tblPr>
-        <w:tblStyle w:val="13"/>
+        <w:tblStyle w:val="16"/>
         <w:tblW w:w="0" w:type="auto"/>
         <w:tblInd w:w="0" w:type="dxa"/>
         <w:tblBorders>
@@ -2497,7 +2860,7 @@
           </w:tcPr>
           <w:p>
             <w:pPr>
-              <w:pStyle w:val="22"/>
+              <w:pStyle w:val="25"/>
               <w:bidi w:val="0"/>
               <w:rPr>
                 <w:rFonts w:hint="eastAsia" w:ascii="宋体" w:hAnsi="宋体" w:eastAsia="宋体" w:cs="宋体"/>
@@ -2519,7 +2882,7 @@
           </w:tcPr>
           <w:p>
             <w:pPr>
-              <w:pStyle w:val="22"/>
+              <w:pStyle w:val="25"/>
               <w:bidi w:val="0"/>
               <w:rPr>
                 <w:rFonts w:hint="eastAsia" w:ascii="宋体" w:hAnsi="宋体" w:eastAsia="宋体" w:cs="宋体"/>
@@ -2559,7 +2922,7 @@
           </w:tcPr>
           <w:p>
             <w:pPr>
-              <w:pStyle w:val="23"/>
+              <w:pStyle w:val="26"/>
               <w:bidi w:val="0"/>
               <w:rPr>
                 <w:rFonts w:hint="eastAsia" w:ascii="宋体" w:hAnsi="宋体" w:eastAsia="宋体" w:cs="宋体"/>
@@ -2581,7 +2944,7 @@
           </w:tcPr>
           <w:p>
             <w:pPr>
-              <w:pStyle w:val="23"/>
+              <w:pStyle w:val="26"/>
               <w:bidi w:val="0"/>
               <w:rPr>
                 <w:rFonts w:hint="eastAsia" w:ascii="宋体" w:hAnsi="宋体" w:eastAsia="宋体" w:cs="宋体"/>
@@ -2601,7 +2964,7 @@
     </w:tbl>
     <w:p>
       <w:pPr>
-        <w:pStyle w:val="33"/>
+        <w:pStyle w:val="38"/>
         <w:bidi w:val="0"/>
         <w:rPr>
           <w:rFonts w:hint="eastAsia" w:ascii="宋体" w:hAnsi="宋体" w:eastAsia="宋体" w:cs="宋体"/>
@@ -2656,182 +3019,267 @@
     </w:p>
     <w:p>
       <w:pPr>
+        <w:pStyle w:val="38"/>
+        <w:bidi w:val="0"/>
+        <w:rPr>
+          <w:rFonts w:hint="eastAsia" w:ascii="宋体" w:hAnsi="宋体" w:eastAsia="宋体" w:cs="宋体"/>
+          <w:lang w:val="en-US" w:eastAsia="zh-CN"/>
+        </w:rPr>
+      </w:pPr>
+      <w:r>
+        <w:rPr>
+          <w:rFonts w:hint="eastAsia" w:ascii="宋体" w:hAnsi="宋体" w:eastAsia="宋体" w:cs="宋体"/>
+          <w:lang w:val="en-US" w:eastAsia="zh-CN"/>
+        </w:rPr>
+        <w:fldChar w:fldCharType="begin"/>
+      </w:r>
+      <w:r>
+        <w:rPr>
+          <w:rFonts w:hint="eastAsia" w:ascii="宋体" w:hAnsi="宋体" w:eastAsia="宋体" w:cs="宋体"/>
+          <w:lang w:val="en-US" w:eastAsia="zh-CN"/>
+        </w:rPr>
+        <w:instrText xml:space="preserve"> STYLEREF KL一级标题 \n \* MERGEFORMAT </w:instrText>
+      </w:r>
+      <w:r>
+        <w:rPr>
+          <w:rFonts w:hint="eastAsia" w:ascii="宋体" w:hAnsi="宋体" w:eastAsia="宋体" w:cs="宋体"/>
+          <w:lang w:val="en-US" w:eastAsia="zh-CN"/>
+        </w:rPr>
+        <w:fldChar w:fldCharType="separate"/>
+      </w:r>
+      <w:r>
+        <w:rPr>
+          <w:rFonts w:hint="eastAsia" w:ascii="宋体" w:hAnsi="宋体" w:eastAsia="宋体" w:cs="宋体"/>
+          <w:lang w:val="en-US" w:eastAsia="zh-CN"/>
+        </w:rPr>
+        <w:t>1</w:t>
+      </w:r>
+      <w:r>
+        <w:rPr>
+          <w:rFonts w:hint="eastAsia" w:ascii="宋体" w:hAnsi="宋体" w:eastAsia="宋体" w:cs="宋体"/>
+          <w:lang w:val="en-US" w:eastAsia="zh-CN"/>
+        </w:rPr>
+        <w:fldChar w:fldCharType="end"/>
+      </w:r>
+      <w:r>
+        <w:rPr>
+          <w:rFonts w:hint="eastAsia" w:ascii="宋体" w:hAnsi="宋体" w:eastAsia="宋体" w:cs="宋体"/>
+          <w:lang w:val="en-US" w:eastAsia="zh-CN"/>
+        </w:rPr>
+        <w:t>-</w:t>
+      </w:r>
+      <w:r>
+        <w:rPr>
+          <w:rFonts w:hint="eastAsia" w:ascii="宋体" w:hAnsi="宋体" w:eastAsia="宋体" w:cs="宋体"/>
+          <w:lang w:val="en-US" w:eastAsia="zh-CN"/>
+        </w:rPr>
+        <w:fldChar w:fldCharType="begin"/>
+      </w:r>
+      <w:r>
+        <w:rPr>
+          <w:rFonts w:hint="eastAsia" w:ascii="宋体" w:hAnsi="宋体" w:eastAsia="宋体" w:cs="宋体"/>
+          <w:lang w:val="en-US" w:eastAsia="zh-CN"/>
+        </w:rPr>
+        <w:instrText xml:space="preserve"> SEQ 图 \* ARABIC \s 1 </w:instrText>
+      </w:r>
+      <w:r>
+        <w:rPr>
+          <w:rFonts w:hint="eastAsia" w:ascii="宋体" w:hAnsi="宋体" w:eastAsia="宋体" w:cs="宋体"/>
+          <w:lang w:val="en-US" w:eastAsia="zh-CN"/>
+        </w:rPr>
+        <w:fldChar w:fldCharType="separate"/>
+      </w:r>
+      <w:r>
+        <w:rPr>
+          <w:rFonts w:hint="eastAsia" w:ascii="宋体" w:hAnsi="宋体" w:eastAsia="宋体" w:cs="宋体"/>
+          <w:lang w:val="en-US" w:eastAsia="zh-CN"/>
+        </w:rPr>
+        <w:t>1</w:t>
+      </w:r>
+      <w:r>
+        <w:rPr>
+          <w:rFonts w:hint="eastAsia" w:ascii="宋体" w:hAnsi="宋体" w:eastAsia="宋体" w:cs="宋体"/>
+          <w:lang w:val="en-US" w:eastAsia="zh-CN"/>
+        </w:rPr>
+        <w:fldChar w:fldCharType="end"/>
+      </w:r>
+      <w:bookmarkStart w:id="10" w:name="_Toc1384"/>
+      <w:r>
+        <w:rPr>
+          <w:rFonts w:hint="eastAsia" w:ascii="宋体" w:hAnsi="宋体" w:eastAsia="宋体" w:cs="宋体"/>
+          <w:lang w:val="en-US" w:eastAsia="zh-CN"/>
+        </w:rPr>
+        <w:t>图注1</w:t>
+      </w:r>
+      <w:bookmarkEnd w:id="10"/>
+    </w:p>
+    <w:p>
+      <w:pPr>
         <w:pStyle w:val="33"/>
         <w:bidi w:val="0"/>
-        <w:rPr>
-          <w:rFonts w:hint="eastAsia" w:ascii="宋体" w:hAnsi="宋体" w:eastAsia="宋体" w:cs="宋体"/>
-          <w:lang w:val="en-US" w:eastAsia="zh-CN"/>
-        </w:rPr>
-      </w:pPr>
-      <w:r>
-        <w:rPr>
-          <w:rFonts w:hint="eastAsia" w:ascii="宋体" w:hAnsi="宋体" w:eastAsia="宋体" w:cs="宋体"/>
-          <w:lang w:val="en-US" w:eastAsia="zh-CN"/>
-        </w:rPr>
-        <w:fldChar w:fldCharType="begin"/>
-      </w:r>
-      <w:r>
-        <w:rPr>
-          <w:rFonts w:hint="eastAsia" w:ascii="宋体" w:hAnsi="宋体" w:eastAsia="宋体" w:cs="宋体"/>
-          <w:lang w:val="en-US" w:eastAsia="zh-CN"/>
-        </w:rPr>
-        <w:instrText xml:space="preserve"> STYLEREF KL一级标题 \n \* MERGEFORMAT </w:instrText>
-      </w:r>
-      <w:r>
-        <w:rPr>
-          <w:rFonts w:hint="eastAsia" w:ascii="宋体" w:hAnsi="宋体" w:eastAsia="宋体" w:cs="宋体"/>
-          <w:lang w:val="en-US" w:eastAsia="zh-CN"/>
-        </w:rPr>
-        <w:fldChar w:fldCharType="separate"/>
-      </w:r>
-      <w:r>
-        <w:rPr>
-          <w:rFonts w:hint="eastAsia" w:ascii="宋体" w:hAnsi="宋体" w:eastAsia="宋体" w:cs="宋体"/>
-          <w:lang w:val="en-US" w:eastAsia="zh-CN"/>
-        </w:rPr>
-        <w:t>1</w:t>
-      </w:r>
-      <w:r>
-        <w:rPr>
-          <w:rFonts w:hint="eastAsia" w:ascii="宋体" w:hAnsi="宋体" w:eastAsia="宋体" w:cs="宋体"/>
-          <w:lang w:val="en-US" w:eastAsia="zh-CN"/>
-        </w:rPr>
-        <w:fldChar w:fldCharType="end"/>
-      </w:r>
-      <w:r>
-        <w:rPr>
-          <w:rFonts w:hint="eastAsia" w:ascii="宋体" w:hAnsi="宋体" w:eastAsia="宋体" w:cs="宋体"/>
-          <w:lang w:val="en-US" w:eastAsia="zh-CN"/>
-        </w:rPr>
-        <w:t>-</w:t>
-      </w:r>
-      <w:r>
-        <w:rPr>
-          <w:rFonts w:hint="eastAsia" w:ascii="宋体" w:hAnsi="宋体" w:eastAsia="宋体" w:cs="宋体"/>
-          <w:lang w:val="en-US" w:eastAsia="zh-CN"/>
-        </w:rPr>
-        <w:fldChar w:fldCharType="begin"/>
-      </w:r>
-      <w:r>
-        <w:rPr>
-          <w:rFonts w:hint="eastAsia" w:ascii="宋体" w:hAnsi="宋体" w:eastAsia="宋体" w:cs="宋体"/>
-          <w:lang w:val="en-US" w:eastAsia="zh-CN"/>
-        </w:rPr>
-        <w:instrText xml:space="preserve"> SEQ 图 \* ARABIC \s 1 </w:instrText>
-      </w:r>
-      <w:r>
-        <w:rPr>
-          <w:rFonts w:hint="eastAsia" w:ascii="宋体" w:hAnsi="宋体" w:eastAsia="宋体" w:cs="宋体"/>
-          <w:lang w:val="en-US" w:eastAsia="zh-CN"/>
-        </w:rPr>
-        <w:fldChar w:fldCharType="separate"/>
-      </w:r>
-      <w:r>
-        <w:rPr>
-          <w:rFonts w:hint="eastAsia" w:ascii="宋体" w:hAnsi="宋体" w:eastAsia="宋体" w:cs="宋体"/>
-          <w:lang w:val="en-US" w:eastAsia="zh-CN"/>
-        </w:rPr>
-        <w:t>1</w:t>
-      </w:r>
-      <w:r>
-        <w:rPr>
-          <w:rFonts w:hint="eastAsia" w:ascii="宋体" w:hAnsi="宋体" w:eastAsia="宋体" w:cs="宋体"/>
-          <w:lang w:val="en-US" w:eastAsia="zh-CN"/>
-        </w:rPr>
-        <w:fldChar w:fldCharType="end"/>
-      </w:r>
-      <w:bookmarkStart w:id="3" w:name="_Toc31056"/>
-      <w:r>
-        <w:rPr>
-          <w:rFonts w:hint="eastAsia" w:ascii="宋体" w:hAnsi="宋体" w:eastAsia="宋体" w:cs="宋体"/>
-          <w:lang w:val="en-US" w:eastAsia="zh-CN"/>
-        </w:rPr>
-        <w:t>图注1</w:t>
-      </w:r>
-      <w:bookmarkEnd w:id="3"/>
+        <w:ind w:left="0" w:leftChars="0" w:firstLine="0" w:firstLineChars="0"/>
+        <w:rPr>
+          <w:rFonts w:hint="eastAsia" w:ascii="宋体" w:hAnsi="宋体" w:eastAsia="宋体" w:cs="宋体"/>
+          <w:lang w:val="en-US" w:eastAsia="zh-CN"/>
+        </w:rPr>
+      </w:pPr>
     </w:p>
     <w:p>
       <w:pPr>
+        <w:pStyle w:val="27"/>
+        <w:bidi w:val="0"/>
+        <w:rPr>
+          <w:rFonts w:hint="eastAsia" w:ascii="宋体" w:hAnsi="宋体" w:eastAsia="宋体" w:cs="宋体"/>
+        </w:rPr>
+      </w:pPr>
+      <w:bookmarkStart w:id="11" w:name="_Toc24400"/>
+      <w:bookmarkStart w:id="12" w:name="_Toc3113"/>
+      <w:r>
+        <w:rPr>
+          <w:rFonts w:hint="eastAsia" w:ascii="宋体" w:hAnsi="宋体" w:eastAsia="宋体" w:cs="宋体"/>
+          <w:lang w:val="en-US" w:eastAsia="zh-CN"/>
+        </w:rPr>
+        <w:t>KL一级标题</w:t>
+      </w:r>
+      <w:bookmarkEnd w:id="11"/>
+      <w:bookmarkEnd w:id="12"/>
+    </w:p>
+    <w:p>
+      <w:pPr>
         <w:pStyle w:val="28"/>
+        <w:rPr>
+          <w:rFonts w:hint="eastAsia" w:ascii="宋体" w:hAnsi="宋体" w:eastAsia="宋体" w:cs="宋体"/>
+        </w:rPr>
+      </w:pPr>
+      <w:bookmarkStart w:id="13" w:name="_Toc26507"/>
+      <w:bookmarkStart w:id="14" w:name="_Toc23681"/>
+      <w:r>
+        <w:rPr>
+          <w:rFonts w:hint="eastAsia" w:ascii="宋体" w:hAnsi="宋体" w:eastAsia="宋体" w:cs="宋体"/>
+          <w:lang w:val="en-US" w:eastAsia="zh-CN"/>
+        </w:rPr>
+        <w:t>KL二级标题</w:t>
+      </w:r>
+      <w:bookmarkEnd w:id="13"/>
+      <w:bookmarkEnd w:id="14"/>
+    </w:p>
+    <w:p>
+      <w:pPr>
+        <w:pStyle w:val="29"/>
+        <w:bidi w:val="0"/>
+        <w:rPr>
+          <w:rFonts w:hint="eastAsia" w:ascii="宋体" w:hAnsi="宋体" w:eastAsia="宋体" w:cs="宋体"/>
+        </w:rPr>
+      </w:pPr>
+      <w:bookmarkStart w:id="15" w:name="_Toc20980"/>
+      <w:bookmarkStart w:id="16" w:name="_Toc19566"/>
+      <w:r>
+        <w:rPr>
+          <w:rFonts w:hint="eastAsia" w:ascii="宋体" w:hAnsi="宋体" w:eastAsia="宋体" w:cs="宋体"/>
+          <w:lang w:val="en-US" w:eastAsia="zh-CN"/>
+        </w:rPr>
+        <w:t>KL三级标题</w:t>
+      </w:r>
+      <w:bookmarkEnd w:id="15"/>
+      <w:bookmarkEnd w:id="16"/>
+    </w:p>
+    <w:p>
+      <w:pPr>
+        <w:pStyle w:val="30"/>
+        <w:numPr>
+          <w:numId w:val="5"/>
+        </w:numPr>
         <w:bidi w:val="0"/>
         <w:ind w:left="0" w:leftChars="0" w:firstLine="0" w:firstLineChars="0"/>
         <w:rPr>
           <w:rFonts w:hint="eastAsia" w:ascii="宋体" w:hAnsi="宋体" w:eastAsia="宋体" w:cs="宋体"/>
-          <w:lang w:val="en-US" w:eastAsia="zh-CN"/>
-        </w:rPr>
-      </w:pPr>
+        </w:rPr>
+      </w:pPr>
+      <w:bookmarkStart w:id="17" w:name="_Toc11385"/>
+      <w:r>
+        <w:rPr>
+          <w:rFonts w:hint="eastAsia" w:ascii="宋体" w:hAnsi="宋体" w:eastAsia="宋体" w:cs="宋体"/>
+          <w:lang w:val="en-US" w:eastAsia="zh-CN"/>
+        </w:rPr>
+        <w:t>KL</w:t>
+      </w:r>
+      <w:r>
+        <w:rPr>
+          <w:rFonts w:hint="eastAsia" w:cs="宋体"/>
+          <w:lang w:val="en-US" w:eastAsia="zh-CN"/>
+        </w:rPr>
+        <w:t>四级标题</w:t>
+      </w:r>
+      <w:bookmarkEnd w:id="17"/>
     </w:p>
     <w:p>
       <w:pPr>
-        <w:pStyle w:val="24"/>
-        <w:bidi w:val="0"/>
-        <w:rPr>
-          <w:rFonts w:hint="eastAsia" w:ascii="宋体" w:hAnsi="宋体" w:eastAsia="宋体" w:cs="宋体"/>
-        </w:rPr>
-      </w:pPr>
-      <w:bookmarkStart w:id="4" w:name="_Toc29659"/>
-      <w:r>
-        <w:rPr>
-          <w:rFonts w:hint="eastAsia" w:ascii="宋体" w:hAnsi="宋体" w:eastAsia="宋体" w:cs="宋体"/>
-          <w:lang w:val="en-US" w:eastAsia="zh-CN"/>
-        </w:rPr>
-        <w:t>KL一级标题</w:t>
-      </w:r>
-      <w:bookmarkEnd w:id="4"/>
+        <w:pStyle w:val="31"/>
+        <w:numPr>
+          <w:numId w:val="5"/>
+        </w:numPr>
+        <w:rPr>
+          <w:rFonts w:hint="eastAsia"/>
+        </w:rPr>
+      </w:pPr>
+      <w:bookmarkStart w:id="18" w:name="_Toc17621"/>
+      <w:r>
+        <w:rPr>
+          <w:rFonts w:hint="eastAsia" w:cs="宋体"/>
+          <w:lang w:val="en-US" w:eastAsia="zh-CN"/>
+        </w:rPr>
+        <w:t>KL五级标题</w:t>
+      </w:r>
+      <w:bookmarkEnd w:id="18"/>
     </w:p>
     <w:p>
       <w:pPr>
-        <w:pStyle w:val="25"/>
-        <w:rPr>
-          <w:rFonts w:hint="eastAsia" w:ascii="宋体" w:hAnsi="宋体" w:eastAsia="宋体" w:cs="宋体"/>
-        </w:rPr>
-      </w:pPr>
-      <w:bookmarkStart w:id="5" w:name="_Toc28147"/>
-      <w:r>
-        <w:rPr>
-          <w:rFonts w:hint="eastAsia" w:ascii="宋体" w:hAnsi="宋体" w:eastAsia="宋体" w:cs="宋体"/>
-          <w:lang w:val="en-US" w:eastAsia="zh-CN"/>
-        </w:rPr>
-        <w:t>KL二级标题</w:t>
-      </w:r>
-      <w:bookmarkEnd w:id="5"/>
+        <w:pStyle w:val="32"/>
+        <w:rPr>
+          <w:rFonts w:hint="eastAsia"/>
+        </w:rPr>
+      </w:pPr>
+      <w:bookmarkStart w:id="19" w:name="_Toc14970"/>
+      <w:r>
+        <w:rPr>
+          <w:rFonts w:hint="eastAsia" w:cs="宋体"/>
+          <w:lang w:val="en-US" w:eastAsia="zh-CN"/>
+        </w:rPr>
+        <w:t>KL六级标题</w:t>
+      </w:r>
+      <w:bookmarkEnd w:id="19"/>
     </w:p>
     <w:p>
       <w:pPr>
-        <w:pStyle w:val="26"/>
+        <w:pStyle w:val="33"/>
         <w:bidi w:val="0"/>
         <w:rPr>
           <w:rFonts w:hint="eastAsia" w:ascii="宋体" w:hAnsi="宋体" w:eastAsia="宋体" w:cs="宋体"/>
-        </w:rPr>
-      </w:pPr>
-      <w:r>
-        <w:rPr>
-          <w:rFonts w:hint="eastAsia" w:ascii="宋体" w:hAnsi="宋体" w:eastAsia="宋体" w:cs="宋体"/>
-          <w:lang w:val="en-US" w:eastAsia="zh-CN"/>
-        </w:rPr>
-        <w:t>KL三级标题</w:t>
+          <w:lang w:val="en-US" w:eastAsia="zh-CN"/>
+        </w:rPr>
+      </w:pPr>
+      <w:r>
+        <w:rPr>
+          <w:rFonts w:hint="eastAsia" w:ascii="宋体" w:hAnsi="宋体" w:eastAsia="宋体" w:cs="宋体"/>
+          <w:lang w:val="en-US" w:eastAsia="zh-CN"/>
+        </w:rPr>
+        <w:t>KL正文</w:t>
       </w:r>
     </w:p>
     <w:p>
       <w:pPr>
-        <w:pStyle w:val="27"/>
+        <w:pStyle w:val="33"/>
         <w:bidi w:val="0"/>
         <w:ind w:left="0" w:leftChars="0" w:firstLine="0" w:firstLineChars="0"/>
         <w:rPr>
           <w:rFonts w:hint="eastAsia" w:ascii="宋体" w:hAnsi="宋体" w:eastAsia="宋体" w:cs="宋体"/>
-        </w:rPr>
-      </w:pPr>
-      <w:r>
-        <w:rPr>
-          <w:rFonts w:hint="eastAsia" w:ascii="宋体" w:hAnsi="宋体" w:eastAsia="宋体" w:cs="宋体"/>
-          <w:lang w:val="en-US" w:eastAsia="zh-CN"/>
-        </w:rPr>
-        <w:t>KL其他标题</w:t>
-      </w:r>
+          <w:lang w:val="en-US" w:eastAsia="zh-CN"/>
+        </w:rPr>
+      </w:pPr>
     </w:p>
     <w:p>
       <w:pPr>
-        <w:pStyle w:val="28"/>
+        <w:pStyle w:val="36"/>
         <w:bidi w:val="0"/>
         <w:rPr>
           <w:rFonts w:hint="eastAsia" w:ascii="宋体" w:hAnsi="宋体" w:eastAsia="宋体" w:cs="宋体"/>
@@ -2843,34 +3291,6 @@
           <w:rFonts w:hint="eastAsia" w:ascii="宋体" w:hAnsi="宋体" w:eastAsia="宋体" w:cs="宋体"/>
           <w:lang w:val="en-US" w:eastAsia="zh-CN"/>
         </w:rPr>
-        <w:t>KL正文</w:t>
-      </w:r>
-    </w:p>
-    <w:p>
-      <w:pPr>
-        <w:pStyle w:val="28"/>
-        <w:bidi w:val="0"/>
-        <w:ind w:left="0" w:leftChars="0" w:firstLine="0" w:firstLineChars="0"/>
-        <w:rPr>
-          <w:rFonts w:hint="eastAsia" w:ascii="宋体" w:hAnsi="宋体" w:eastAsia="宋体" w:cs="宋体"/>
-          <w:lang w:val="en-US" w:eastAsia="zh-CN"/>
-        </w:rPr>
-      </w:pPr>
-    </w:p>
-    <w:p>
-      <w:pPr>
-        <w:pStyle w:val="31"/>
-        <w:bidi w:val="0"/>
-        <w:rPr>
-          <w:rFonts w:hint="eastAsia" w:ascii="宋体" w:hAnsi="宋体" w:eastAsia="宋体" w:cs="宋体"/>
-          <w:lang w:val="en-US" w:eastAsia="zh-CN"/>
-        </w:rPr>
-      </w:pPr>
-      <w:r>
-        <w:rPr>
-          <w:rFonts w:hint="eastAsia" w:ascii="宋体" w:hAnsi="宋体" w:eastAsia="宋体" w:cs="宋体"/>
-          <w:lang w:val="en-US" w:eastAsia="zh-CN"/>
-        </w:rPr>
         <w:fldChar w:fldCharType="begin"/>
       </w:r>
       <w:r>
@@ -2943,7 +3363,7 @@
         </w:rPr>
         <w:fldChar w:fldCharType="end"/>
       </w:r>
-      <w:bookmarkStart w:id="6" w:name="_Toc8473"/>
+      <w:bookmarkStart w:id="20" w:name="_Toc29157"/>
       <w:r>
         <w:rPr>
           <w:rFonts w:hint="eastAsia" w:ascii="宋体" w:hAnsi="宋体" w:eastAsia="宋体" w:cs="宋体"/>
@@ -2951,11 +3371,11 @@
         </w:rPr>
         <w:t>表注2</w:t>
       </w:r>
-      <w:bookmarkEnd w:id="6"/>
+      <w:bookmarkEnd w:id="20"/>
     </w:p>
     <w:tbl>
       <w:tblPr>
-        <w:tblStyle w:val="13"/>
+        <w:tblStyle w:val="16"/>
         <w:tblW w:w="0" w:type="auto"/>
         <w:tblInd w:w="0" w:type="dxa"/>
         <w:tblBorders>
@@ -3001,7 +3421,7 @@
           </w:tcPr>
           <w:p>
             <w:pPr>
-              <w:pStyle w:val="22"/>
+              <w:pStyle w:val="25"/>
               <w:bidi w:val="0"/>
               <w:rPr>
                 <w:rFonts w:hint="eastAsia" w:ascii="宋体" w:hAnsi="宋体" w:eastAsia="宋体" w:cs="宋体"/>
@@ -3023,7 +3443,7 @@
           </w:tcPr>
           <w:p>
             <w:pPr>
-              <w:pStyle w:val="22"/>
+              <w:pStyle w:val="25"/>
               <w:bidi w:val="0"/>
               <w:rPr>
                 <w:rFonts w:hint="eastAsia" w:ascii="宋体" w:hAnsi="宋体" w:eastAsia="宋体" w:cs="宋体"/>
@@ -3063,7 +3483,7 @@
           </w:tcPr>
           <w:p>
             <w:pPr>
-              <w:pStyle w:val="23"/>
+              <w:pStyle w:val="26"/>
               <w:bidi w:val="0"/>
               <w:rPr>
                 <w:rFonts w:hint="eastAsia" w:ascii="宋体" w:hAnsi="宋体" w:eastAsia="宋体" w:cs="宋体"/>
@@ -3085,7 +3505,7 @@
           </w:tcPr>
           <w:p>
             <w:pPr>
-              <w:pStyle w:val="23"/>
+              <w:pStyle w:val="26"/>
               <w:bidi w:val="0"/>
               <w:rPr>
                 <w:rFonts w:hint="eastAsia" w:ascii="宋体" w:hAnsi="宋体" w:eastAsia="宋体" w:cs="宋体"/>
@@ -3105,7 +3525,7 @@
     </w:tbl>
     <w:p>
       <w:pPr>
-        <w:pStyle w:val="33"/>
+        <w:pStyle w:val="38"/>
         <w:bidi w:val="0"/>
         <w:rPr>
           <w:rFonts w:hint="eastAsia" w:ascii="宋体" w:hAnsi="宋体" w:eastAsia="宋体" w:cs="宋体"/>
@@ -3160,7 +3580,7 @@
     </w:p>
     <w:p>
       <w:pPr>
-        <w:pStyle w:val="33"/>
+        <w:pStyle w:val="38"/>
         <w:bidi w:val="0"/>
         <w:rPr>
           <w:rFonts w:hint="eastAsia" w:ascii="宋体" w:hAnsi="宋体" w:eastAsia="宋体" w:cs="宋体"/>
@@ -3244,7 +3664,7 @@
         </w:rPr>
         <w:fldChar w:fldCharType="end"/>
       </w:r>
-      <w:bookmarkStart w:id="7" w:name="_Toc4627"/>
+      <w:bookmarkStart w:id="21" w:name="_Toc31190"/>
       <w:r>
         <w:rPr>
           <w:rFonts w:hint="eastAsia" w:ascii="宋体" w:hAnsi="宋体" w:eastAsia="宋体" w:cs="宋体"/>
@@ -3252,29 +3672,7 @@
         </w:rPr>
         <w:t>图注2</w:t>
       </w:r>
-      <w:bookmarkEnd w:id="7"/>
-    </w:p>
-    <w:p>
-      <w:pPr>
-        <w:pStyle w:val="28"/>
-        <w:bidi w:val="0"/>
-        <w:ind w:left="0" w:leftChars="0" w:firstLine="0" w:firstLineChars="0"/>
-        <w:rPr>
-          <w:rFonts w:hint="eastAsia" w:ascii="宋体" w:hAnsi="宋体" w:eastAsia="宋体" w:cs="宋体"/>
-          <w:lang w:val="en-US" w:eastAsia="zh-CN"/>
-        </w:rPr>
-      </w:pPr>
-    </w:p>
-    <w:p>
-      <w:pPr>
-        <w:pStyle w:val="28"/>
-        <w:bidi w:val="0"/>
-        <w:ind w:left="0" w:leftChars="0" w:firstLine="0" w:firstLineChars="0"/>
-        <w:rPr>
-          <w:rFonts w:hint="eastAsia" w:ascii="宋体" w:hAnsi="宋体" w:eastAsia="宋体" w:cs="宋体"/>
-          <w:lang w:val="en-US" w:eastAsia="zh-CN"/>
-        </w:rPr>
-      </w:pPr>
+      <w:bookmarkEnd w:id="21"/>
     </w:p>
     <w:sectPr>
       <w:footerReference r:id="rId15" w:type="default"/>
@@ -3317,7 +3715,7 @@
 <w:ftr xmlns:wpc="http://schemas.microsoft.com/office/word/2010/wordprocessingCanvas" xmlns:mc="http://schemas.openxmlformats.org/markup-compatibility/2006" xmlns:o="urn:schemas-microsoft-com:office:office" xmlns:r="http://schemas.openxmlformats.org/officeDocument/2006/relationships" xmlns:m="http://schemas.openxmlformats.org/officeDocument/2006/math" xmlns:v="urn:schemas-microsoft-com:vml" xmlns:wp14="http://schemas.microsoft.com/office/word/2010/wordprocessingDrawing" xmlns:wp="http://schemas.openxmlformats.org/drawingml/2006/wordprocessingDrawing" xmlns:w10="urn:schemas-microsoft-com:office:word" xmlns:w="http://schemas.openxmlformats.org/wordprocessingml/2006/main" xmlns:w14="http://schemas.microsoft.com/office/word/2010/wordml" xmlns:w15="http://schemas.microsoft.com/office/word/2012/wordml" xmlns:wpg="http://schemas.microsoft.com/office/word/2010/wordprocessingGroup" xmlns:wpi="http://schemas.microsoft.com/office/word/2010/wordprocessingInk" xmlns:wne="http://schemas.microsoft.com/office/word/2006/wordml" xmlns:wps="http://schemas.microsoft.com/office/word/2010/wordprocessingShape" xmlns:wpsCustomData="http://www.wps.cn/officeDocument/2013/wpsCustomData" mc:Ignorable="w14 w15 wp14">
   <w:p>
     <w:pPr>
-      <w:pStyle w:val="7"/>
+      <w:pStyle w:val="8"/>
       <w:rPr>
         <w:rFonts w:hint="eastAsia" w:eastAsia="宋体" w:asciiTheme="minorEastAsia" w:hAnsiTheme="minorEastAsia"/>
         <w:sz w:val="21"/>
@@ -3350,35 +3748,35 @@
 <w:ftr xmlns:wpc="http://schemas.microsoft.com/office/word/2010/wordprocessingCanvas" xmlns:mc="http://schemas.openxmlformats.org/markup-compatibility/2006" xmlns:o="urn:schemas-microsoft-com:office:office" xmlns:r="http://schemas.openxmlformats.org/officeDocument/2006/relationships" xmlns:m="http://schemas.openxmlformats.org/officeDocument/2006/math" xmlns:v="urn:schemas-microsoft-com:vml" xmlns:wp14="http://schemas.microsoft.com/office/word/2010/wordprocessingDrawing" xmlns:wp="http://schemas.openxmlformats.org/drawingml/2006/wordprocessingDrawing" xmlns:w10="urn:schemas-microsoft-com:office:word" xmlns:w="http://schemas.openxmlformats.org/wordprocessingml/2006/main" xmlns:w14="http://schemas.microsoft.com/office/word/2010/wordml" xmlns:w15="http://schemas.microsoft.com/office/word/2012/wordml" xmlns:wpg="http://schemas.microsoft.com/office/word/2010/wordprocessingGroup" xmlns:wpi="http://schemas.microsoft.com/office/word/2010/wordprocessingInk" xmlns:wne="http://schemas.microsoft.com/office/word/2006/wordml" xmlns:wps="http://schemas.microsoft.com/office/word/2010/wordprocessingShape" xmlns:wpsCustomData="http://www.wps.cn/officeDocument/2013/wpsCustomData" mc:Ignorable="w14 w15 wp14">
   <w:p>
     <w:pPr>
-      <w:pStyle w:val="7"/>
+      <w:pStyle w:val="8"/>
       <w:framePr w:wrap="around" w:vAnchor="text" w:hAnchor="margin" w:xAlign="right" w:y="1"/>
       <w:ind w:firstLine="360"/>
       <w:rPr>
-        <w:rStyle w:val="15"/>
+        <w:rStyle w:val="18"/>
       </w:rPr>
     </w:pPr>
     <w:r>
       <w:rPr>
-        <w:rStyle w:val="15"/>
+        <w:rStyle w:val="18"/>
       </w:rPr>
       <w:fldChar w:fldCharType="begin"/>
     </w:r>
     <w:r>
       <w:rPr>
-        <w:rStyle w:val="15"/>
+        <w:rStyle w:val="18"/>
       </w:rPr>
       <w:instrText xml:space="preserve">PAGE  </w:instrText>
     </w:r>
     <w:r>
       <w:rPr>
-        <w:rStyle w:val="15"/>
+        <w:rStyle w:val="18"/>
       </w:rPr>
       <w:fldChar w:fldCharType="end"/>
     </w:r>
   </w:p>
   <w:p>
     <w:pPr>
-      <w:pStyle w:val="7"/>
+      <w:pStyle w:val="8"/>
       <w:ind w:right="360" w:firstLine="360"/>
     </w:pPr>
   </w:p>
@@ -3389,7 +3787,7 @@
 <w:ftr xmlns:wpc="http://schemas.microsoft.com/office/word/2010/wordprocessingCanvas" xmlns:mc="http://schemas.openxmlformats.org/markup-compatibility/2006" xmlns:o="urn:schemas-microsoft-com:office:office" xmlns:r="http://schemas.openxmlformats.org/officeDocument/2006/relationships" xmlns:m="http://schemas.openxmlformats.org/officeDocument/2006/math" xmlns:v="urn:schemas-microsoft-com:vml" xmlns:wp14="http://schemas.microsoft.com/office/word/2010/wordprocessingDrawing" xmlns:wp="http://schemas.openxmlformats.org/drawingml/2006/wordprocessingDrawing" xmlns:w10="urn:schemas-microsoft-com:office:word" xmlns:w="http://schemas.openxmlformats.org/wordprocessingml/2006/main" xmlns:w14="http://schemas.microsoft.com/office/word/2010/wordml" xmlns:w15="http://schemas.microsoft.com/office/word/2012/wordml" xmlns:wpg="http://schemas.microsoft.com/office/word/2010/wordprocessingGroup" xmlns:wpi="http://schemas.microsoft.com/office/word/2010/wordprocessingInk" xmlns:wne="http://schemas.microsoft.com/office/word/2006/wordml" xmlns:wps="http://schemas.microsoft.com/office/word/2010/wordprocessingShape" xmlns:wpsCustomData="http://www.wps.cn/officeDocument/2013/wpsCustomData" mc:Ignorable="w14 w15 wp14">
   <w:p>
     <w:pPr>
-      <w:pStyle w:val="7"/>
+      <w:pStyle w:val="8"/>
       <w:ind w:firstLine="360"/>
     </w:pPr>
   </w:p>
@@ -3400,7 +3798,7 @@
 <w:ftr xmlns:wpc="http://schemas.microsoft.com/office/word/2010/wordprocessingCanvas" xmlns:mc="http://schemas.openxmlformats.org/markup-compatibility/2006" xmlns:o="urn:schemas-microsoft-com:office:office" xmlns:r="http://schemas.openxmlformats.org/officeDocument/2006/relationships" xmlns:m="http://schemas.openxmlformats.org/officeDocument/2006/math" xmlns:v="urn:schemas-microsoft-com:vml" xmlns:wp14="http://schemas.microsoft.com/office/word/2010/wordprocessingDrawing" xmlns:wp="http://schemas.openxmlformats.org/drawingml/2006/wordprocessingDrawing" xmlns:w10="urn:schemas-microsoft-com:office:word" xmlns:w="http://schemas.openxmlformats.org/wordprocessingml/2006/main" xmlns:w14="http://schemas.microsoft.com/office/word/2010/wordml" xmlns:w15="http://schemas.microsoft.com/office/word/2012/wordml" xmlns:wpg="http://schemas.microsoft.com/office/word/2010/wordprocessingGroup" xmlns:wpi="http://schemas.microsoft.com/office/word/2010/wordprocessingInk" xmlns:wne="http://schemas.microsoft.com/office/word/2006/wordml" xmlns:wps="http://schemas.microsoft.com/office/word/2010/wordprocessingShape" xmlns:wpsCustomData="http://www.wps.cn/officeDocument/2013/wpsCustomData" mc:Ignorable="w14 w15 wp14">
   <w:p>
     <w:pPr>
-      <w:pStyle w:val="7"/>
+      <w:pStyle w:val="8"/>
       <w:jc w:val="center"/>
       <w:rPr>
         <w:rFonts w:asciiTheme="minorEastAsia" w:hAnsiTheme="minorEastAsia"/>
@@ -3411,7 +3809,7 @@
   </w:p>
   <w:p>
     <w:pPr>
-      <w:pStyle w:val="7"/>
+      <w:pStyle w:val="8"/>
       <w:rPr>
         <w:rFonts w:hint="eastAsia" w:eastAsia="宋体" w:asciiTheme="minorEastAsia" w:hAnsiTheme="minorEastAsia"/>
         <w:sz w:val="21"/>
@@ -3444,7 +3842,7 @@
 <w:ftr xmlns:wpc="http://schemas.microsoft.com/office/word/2010/wordprocessingCanvas" xmlns:mc="http://schemas.openxmlformats.org/markup-compatibility/2006" xmlns:o="urn:schemas-microsoft-com:office:office" xmlns:r="http://schemas.openxmlformats.org/officeDocument/2006/relationships" xmlns:m="http://schemas.openxmlformats.org/officeDocument/2006/math" xmlns:v="urn:schemas-microsoft-com:vml" xmlns:wp14="http://schemas.microsoft.com/office/word/2010/wordprocessingDrawing" xmlns:wp="http://schemas.openxmlformats.org/drawingml/2006/wordprocessingDrawing" xmlns:w10="urn:schemas-microsoft-com:office:word" xmlns:w="http://schemas.openxmlformats.org/wordprocessingml/2006/main" xmlns:w14="http://schemas.microsoft.com/office/word/2010/wordml" xmlns:w15="http://schemas.microsoft.com/office/word/2012/wordml" xmlns:wpg="http://schemas.microsoft.com/office/word/2010/wordprocessingGroup" xmlns:wpi="http://schemas.microsoft.com/office/word/2010/wordprocessingInk" xmlns:wne="http://schemas.microsoft.com/office/word/2006/wordml" xmlns:wps="http://schemas.microsoft.com/office/word/2010/wordprocessingShape" xmlns:wpsCustomData="http://www.wps.cn/officeDocument/2013/wpsCustomData" mc:Ignorable="w14 w15 wp14">
   <w:p>
     <w:pPr>
-      <w:pStyle w:val="7"/>
+      <w:pStyle w:val="8"/>
       <w:jc w:val="center"/>
       <w:rPr>
         <w:rFonts w:asciiTheme="minorEastAsia" w:hAnsiTheme="minorEastAsia"/>
@@ -3507,7 +3905,7 @@
                       <w:txbxContent>
                         <w:p>
                           <w:pPr>
-                            <w:pStyle w:val="7"/>
+                            <w:pStyle w:val="8"/>
                           </w:pPr>
                           <w:r>
                             <w:fldChar w:fldCharType="begin"/>
@@ -3556,7 +3954,7 @@
                 <w:txbxContent>
                   <w:p>
                     <w:pPr>
-                      <w:pStyle w:val="7"/>
+                      <w:pStyle w:val="8"/>
                     </w:pPr>
                     <w:r>
                       <w:fldChar w:fldCharType="begin"/>
@@ -3593,7 +3991,7 @@
   </w:p>
   <w:p>
     <w:pPr>
-      <w:pStyle w:val="7"/>
+      <w:pStyle w:val="8"/>
       <w:rPr>
         <w:rFonts w:hint="eastAsia" w:eastAsia="宋体" w:asciiTheme="minorEastAsia" w:hAnsiTheme="minorEastAsia"/>
         <w:sz w:val="21"/>
@@ -3626,7 +4024,7 @@
 <w:ftr xmlns:wpc="http://schemas.microsoft.com/office/word/2010/wordprocessingCanvas" xmlns:mc="http://schemas.openxmlformats.org/markup-compatibility/2006" xmlns:o="urn:schemas-microsoft-com:office:office" xmlns:r="http://schemas.openxmlformats.org/officeDocument/2006/relationships" xmlns:m="http://schemas.openxmlformats.org/officeDocument/2006/math" xmlns:v="urn:schemas-microsoft-com:vml" xmlns:wp14="http://schemas.microsoft.com/office/word/2010/wordprocessingDrawing" xmlns:wp="http://schemas.openxmlformats.org/drawingml/2006/wordprocessingDrawing" xmlns:w10="urn:schemas-microsoft-com:office:word" xmlns:w="http://schemas.openxmlformats.org/wordprocessingml/2006/main" xmlns:w14="http://schemas.microsoft.com/office/word/2010/wordml" xmlns:w15="http://schemas.microsoft.com/office/word/2012/wordml" xmlns:wpg="http://schemas.microsoft.com/office/word/2010/wordprocessingGroup" xmlns:wpi="http://schemas.microsoft.com/office/word/2010/wordprocessingInk" xmlns:wne="http://schemas.microsoft.com/office/word/2006/wordml" xmlns:wps="http://schemas.microsoft.com/office/word/2010/wordprocessingShape" xmlns:wpsCustomData="http://www.wps.cn/officeDocument/2013/wpsCustomData" mc:Ignorable="w14 w15 wp14">
   <w:p>
     <w:pPr>
-      <w:pStyle w:val="7"/>
+      <w:pStyle w:val="8"/>
       <w:jc w:val="center"/>
       <w:rPr>
         <w:rFonts w:asciiTheme="minorEastAsia" w:hAnsiTheme="minorEastAsia"/>
@@ -3704,7 +4102,7 @@
                           <w:sdtContent>
                             <w:p>
                               <w:pPr>
-                                <w:pStyle w:val="7"/>
+                                <w:pStyle w:val="8"/>
                                 <w:jc w:val="center"/>
                                 <w:rPr>
                                   <w:rFonts w:asciiTheme="minorEastAsia" w:hAnsiTheme="minorEastAsia"/>
@@ -3776,7 +4174,7 @@
                     <w:sdtContent>
                       <w:p>
                         <w:pPr>
-                          <w:pStyle w:val="7"/>
+                          <w:pStyle w:val="8"/>
                           <w:jc w:val="center"/>
                           <w:rPr>
                             <w:rFonts w:asciiTheme="minorEastAsia" w:hAnsiTheme="minorEastAsia"/>
@@ -3821,7 +4219,7 @@
   </w:p>
   <w:p>
     <w:pPr>
-      <w:pStyle w:val="7"/>
+      <w:pStyle w:val="8"/>
       <w:rPr>
         <w:rFonts w:hint="eastAsia" w:eastAsia="宋体" w:asciiTheme="minorEastAsia" w:hAnsiTheme="minorEastAsia"/>
         <w:sz w:val="21"/>
@@ -3854,7 +4252,7 @@
 <w:ftr xmlns:wpc="http://schemas.microsoft.com/office/word/2010/wordprocessingCanvas" xmlns:mc="http://schemas.openxmlformats.org/markup-compatibility/2006" xmlns:o="urn:schemas-microsoft-com:office:office" xmlns:r="http://schemas.openxmlformats.org/officeDocument/2006/relationships" xmlns:m="http://schemas.openxmlformats.org/officeDocument/2006/math" xmlns:v="urn:schemas-microsoft-com:vml" xmlns:wp14="http://schemas.microsoft.com/office/word/2010/wordprocessingDrawing" xmlns:wp="http://schemas.openxmlformats.org/drawingml/2006/wordprocessingDrawing" xmlns:w10="urn:schemas-microsoft-com:office:word" xmlns:w="http://schemas.openxmlformats.org/wordprocessingml/2006/main" xmlns:w14="http://schemas.microsoft.com/office/word/2010/wordml" xmlns:w15="http://schemas.microsoft.com/office/word/2012/wordml" xmlns:wpg="http://schemas.microsoft.com/office/word/2010/wordprocessingGroup" xmlns:wpi="http://schemas.microsoft.com/office/word/2010/wordprocessingInk" xmlns:wne="http://schemas.microsoft.com/office/word/2006/wordml" xmlns:wps="http://schemas.microsoft.com/office/word/2010/wordprocessingShape" xmlns:wpsCustomData="http://www.wps.cn/officeDocument/2013/wpsCustomData" mc:Ignorable="w14 w15 wp14">
   <w:p>
     <w:pPr>
-      <w:pStyle w:val="7"/>
+      <w:pStyle w:val="8"/>
       <w:jc w:val="center"/>
       <w:rPr>
         <w:rFonts w:asciiTheme="minorEastAsia" w:hAnsiTheme="minorEastAsia"/>
@@ -3932,7 +4330,7 @@
                           <w:sdtContent>
                             <w:p>
                               <w:pPr>
-                                <w:pStyle w:val="7"/>
+                                <w:pStyle w:val="8"/>
                                 <w:jc w:val="center"/>
                                 <w:rPr>
                                   <w:rFonts w:asciiTheme="minorEastAsia" w:hAnsiTheme="minorEastAsia"/>
@@ -4004,7 +4402,7 @@
                     <w:sdtContent>
                       <w:p>
                         <w:pPr>
-                          <w:pStyle w:val="7"/>
+                          <w:pStyle w:val="8"/>
                           <w:jc w:val="center"/>
                           <w:rPr>
                             <w:rFonts w:asciiTheme="minorEastAsia" w:hAnsiTheme="minorEastAsia"/>
@@ -4049,7 +4447,7 @@
   </w:p>
   <w:p>
     <w:pPr>
-      <w:pStyle w:val="7"/>
+      <w:pStyle w:val="8"/>
       <w:rPr>
         <w:rFonts w:hint="eastAsia" w:eastAsia="宋体" w:asciiTheme="minorEastAsia" w:hAnsiTheme="minorEastAsia"/>
         <w:sz w:val="21"/>
@@ -4082,7 +4480,7 @@
 <w:ftr xmlns:wpc="http://schemas.microsoft.com/office/word/2010/wordprocessingCanvas" xmlns:mc="http://schemas.openxmlformats.org/markup-compatibility/2006" xmlns:o="urn:schemas-microsoft-com:office:office" xmlns:r="http://schemas.openxmlformats.org/officeDocument/2006/relationships" xmlns:m="http://schemas.openxmlformats.org/officeDocument/2006/math" xmlns:v="urn:schemas-microsoft-com:vml" xmlns:wp14="http://schemas.microsoft.com/office/word/2010/wordprocessingDrawing" xmlns:wp="http://schemas.openxmlformats.org/drawingml/2006/wordprocessingDrawing" xmlns:w10="urn:schemas-microsoft-com:office:word" xmlns:w="http://schemas.openxmlformats.org/wordprocessingml/2006/main" xmlns:w14="http://schemas.microsoft.com/office/word/2010/wordml" xmlns:w15="http://schemas.microsoft.com/office/word/2012/wordml" xmlns:wpg="http://schemas.microsoft.com/office/word/2010/wordprocessingGroup" xmlns:wpi="http://schemas.microsoft.com/office/word/2010/wordprocessingInk" xmlns:wne="http://schemas.microsoft.com/office/word/2006/wordml" xmlns:wps="http://schemas.microsoft.com/office/word/2010/wordprocessingShape" xmlns:wpsCustomData="http://www.wps.cn/officeDocument/2013/wpsCustomData" mc:Ignorable="w14 w15 wp14">
   <w:p>
     <w:pPr>
-      <w:pStyle w:val="7"/>
+      <w:pStyle w:val="8"/>
       <w:jc w:val="center"/>
       <w:rPr>
         <w:rFonts w:asciiTheme="minorEastAsia" w:hAnsiTheme="minorEastAsia"/>
@@ -4175,7 +4573,7 @@
                               <w:sdtContent>
                                 <w:p>
                                   <w:pPr>
-                                    <w:pStyle w:val="7"/>
+                                    <w:pStyle w:val="8"/>
                                     <w:jc w:val="center"/>
                                     <w:rPr>
                                       <w:rFonts w:ascii="宋体" w:hAnsi="宋体" w:eastAsia="宋体"/>
@@ -4244,7 +4642,7 @@
                             </w:sdt>
                             <w:p>
                               <w:pPr>
-                                <w:pStyle w:val="7"/>
+                                <w:pStyle w:val="8"/>
                                 <w:jc w:val="center"/>
                                 <w:rPr>
                                   <w:rFonts w:asciiTheme="minorEastAsia" w:hAnsiTheme="minorEastAsia"/>
@@ -4307,7 +4705,7 @@
                         <w:sdtContent>
                           <w:p>
                             <w:pPr>
-                              <w:pStyle w:val="7"/>
+                              <w:pStyle w:val="8"/>
                               <w:jc w:val="center"/>
                               <w:rPr>
                                 <w:rFonts w:ascii="宋体" w:hAnsi="宋体" w:eastAsia="宋体"/>
@@ -4376,7 +4774,7 @@
                       </w:sdt>
                       <w:p>
                         <w:pPr>
-                          <w:pStyle w:val="7"/>
+                          <w:pStyle w:val="8"/>
                           <w:jc w:val="center"/>
                           <w:rPr>
                             <w:rFonts w:asciiTheme="minorEastAsia" w:hAnsiTheme="minorEastAsia"/>
@@ -4397,7 +4795,7 @@
   </w:p>
   <w:p>
     <w:pPr>
-      <w:pStyle w:val="7"/>
+      <w:pStyle w:val="8"/>
       <w:rPr>
         <w:rFonts w:hint="eastAsia" w:eastAsia="宋体" w:asciiTheme="minorEastAsia" w:hAnsiTheme="minorEastAsia"/>
         <w:sz w:val="21"/>
@@ -4455,7 +4853,7 @@
 <w:hdr xmlns:wpc="http://schemas.microsoft.com/office/word/2010/wordprocessingCanvas" xmlns:mc="http://schemas.openxmlformats.org/markup-compatibility/2006" xmlns:o="urn:schemas-microsoft-com:office:office" xmlns:r="http://schemas.openxmlformats.org/officeDocument/2006/relationships" xmlns:m="http://schemas.openxmlformats.org/officeDocument/2006/math" xmlns:v="urn:schemas-microsoft-com:vml" xmlns:wp14="http://schemas.microsoft.com/office/word/2010/wordprocessingDrawing" xmlns:wp="http://schemas.openxmlformats.org/drawingml/2006/wordprocessingDrawing" xmlns:w10="urn:schemas-microsoft-com:office:word" xmlns:w="http://schemas.openxmlformats.org/wordprocessingml/2006/main" xmlns:w14="http://schemas.microsoft.com/office/word/2010/wordml" xmlns:w15="http://schemas.microsoft.com/office/word/2012/wordml" xmlns:wpg="http://schemas.microsoft.com/office/word/2010/wordprocessingGroup" xmlns:wpi="http://schemas.microsoft.com/office/word/2010/wordprocessingInk" xmlns:wne="http://schemas.microsoft.com/office/word/2006/wordml" xmlns:wps="http://schemas.microsoft.com/office/word/2010/wordprocessingShape" xmlns:wpsCustomData="http://www.wps.cn/officeDocument/2013/wpsCustomData" mc:Ignorable="w14 w15 wp14">
   <w:p>
     <w:pPr>
-      <w:pStyle w:val="8"/>
+      <w:pStyle w:val="9"/>
       <w:jc w:val="center"/>
       <w:rPr>
         <w:rFonts w:hint="default" w:ascii="宋体" w:hAnsi="宋体" w:eastAsia="宋体"/>
@@ -4481,7 +4879,7 @@
 <w:hdr xmlns:wpc="http://schemas.microsoft.com/office/word/2010/wordprocessingCanvas" xmlns:mc="http://schemas.openxmlformats.org/markup-compatibility/2006" xmlns:o="urn:schemas-microsoft-com:office:office" xmlns:r="http://schemas.openxmlformats.org/officeDocument/2006/relationships" xmlns:m="http://schemas.openxmlformats.org/officeDocument/2006/math" xmlns:v="urn:schemas-microsoft-com:vml" xmlns:wp14="http://schemas.microsoft.com/office/word/2010/wordprocessingDrawing" xmlns:wp="http://schemas.openxmlformats.org/drawingml/2006/wordprocessingDrawing" xmlns:w10="urn:schemas-microsoft-com:office:word" xmlns:w="http://schemas.openxmlformats.org/wordprocessingml/2006/main" xmlns:w14="http://schemas.microsoft.com/office/word/2010/wordml" xmlns:w15="http://schemas.microsoft.com/office/word/2012/wordml" xmlns:wpg="http://schemas.microsoft.com/office/word/2010/wordprocessingGroup" xmlns:wpi="http://schemas.microsoft.com/office/word/2010/wordprocessingInk" xmlns:wne="http://schemas.microsoft.com/office/word/2006/wordml" xmlns:wps="http://schemas.microsoft.com/office/word/2010/wordprocessingShape" xmlns:wpsCustomData="http://www.wps.cn/officeDocument/2013/wpsCustomData" mc:Ignorable="w14 w15 wp14">
   <w:p>
     <w:pPr>
-      <w:pStyle w:val="8"/>
+      <w:pStyle w:val="9"/>
       <w:ind w:firstLine="360"/>
     </w:pPr>
   </w:p>
@@ -4492,7 +4890,7 @@
 <w:hdr xmlns:wpc="http://schemas.microsoft.com/office/word/2010/wordprocessingCanvas" xmlns:mc="http://schemas.openxmlformats.org/markup-compatibility/2006" xmlns:o="urn:schemas-microsoft-com:office:office" xmlns:r="http://schemas.openxmlformats.org/officeDocument/2006/relationships" xmlns:m="http://schemas.openxmlformats.org/officeDocument/2006/math" xmlns:v="urn:schemas-microsoft-com:vml" xmlns:wp14="http://schemas.microsoft.com/office/word/2010/wordprocessingDrawing" xmlns:wp="http://schemas.openxmlformats.org/drawingml/2006/wordprocessingDrawing" xmlns:w10="urn:schemas-microsoft-com:office:word" xmlns:w="http://schemas.openxmlformats.org/wordprocessingml/2006/main" xmlns:w14="http://schemas.microsoft.com/office/word/2010/wordml" xmlns:w15="http://schemas.microsoft.com/office/word/2012/wordml" xmlns:wpg="http://schemas.microsoft.com/office/word/2010/wordprocessingGroup" xmlns:wpi="http://schemas.microsoft.com/office/word/2010/wordprocessingInk" xmlns:wne="http://schemas.microsoft.com/office/word/2006/wordml" xmlns:wps="http://schemas.microsoft.com/office/word/2010/wordprocessingShape" xmlns:wpsCustomData="http://www.wps.cn/officeDocument/2013/wpsCustomData" mc:Ignorable="w14 w15 wp14">
   <w:p>
     <w:pPr>
-      <w:pStyle w:val="8"/>
+      <w:pStyle w:val="9"/>
       <w:ind w:firstLine="360"/>
     </w:pPr>
   </w:p>
@@ -4502,9 +4900,135 @@
 <file path=word/numbering.xml><?xml version="1.0" encoding="utf-8"?>
 <w:numbering xmlns:wpc="http://schemas.microsoft.com/office/word/2010/wordprocessingCanvas" xmlns:mc="http://schemas.openxmlformats.org/markup-compatibility/2006" xmlns:o="urn:schemas-microsoft-com:office:office" xmlns:r="http://schemas.openxmlformats.org/officeDocument/2006/relationships" xmlns:m="http://schemas.openxmlformats.org/officeDocument/2006/math" xmlns:v="urn:schemas-microsoft-com:vml" xmlns:wp14="http://schemas.microsoft.com/office/word/2010/wordprocessingDrawing" xmlns:wp="http://schemas.openxmlformats.org/drawingml/2006/wordprocessingDrawing" xmlns:w10="urn:schemas-microsoft-com:office:word" xmlns:w="http://schemas.openxmlformats.org/wordprocessingml/2006/main" xmlns:w14="http://schemas.microsoft.com/office/word/2010/wordml" xmlns:wpg="http://schemas.microsoft.com/office/word/2010/wordprocessingGroup" xmlns:wpi="http://schemas.microsoft.com/office/word/2010/wordprocessingInk" xmlns:wne="http://schemas.microsoft.com/office/word/2006/wordml" xmlns:wps="http://schemas.microsoft.com/office/word/2010/wordprocessingShape" xmlns:wpsCustomData="http://www.wps.cn/officeDocument/2013/wpsCustomData" mc:Ignorable="w14 wp14">
   <w:abstractNum w:abstractNumId="0">
-    <w:nsid w:val="9DB3B0EC"/>
+    <w:nsid w:val="E4102B9A"/>
     <w:multiLevelType w:val="multilevel"/>
-    <w:tmpl w:val="9DB3B0EC"/>
+    <w:tmpl w:val="E4102B9A"/>
+    <w:lvl w:ilvl="0" w:tentative="0">
+      <w:start w:val="1"/>
+      <w:numFmt w:val="decimal"/>
+      <w:lvlText w:val="%1"/>
+      <w:lvlJc w:val="left"/>
+      <w:pPr>
+        <w:ind w:left="425" w:hanging="425"/>
+      </w:pPr>
+      <w:rPr>
+        <w:rFonts w:hint="default"/>
+        <w:sz w:val="24"/>
+        <w:szCs w:val="24"/>
+      </w:rPr>
+    </w:lvl>
+    <w:lvl w:ilvl="1" w:tentative="0">
+      <w:start w:val="1"/>
+      <w:numFmt w:val="decimal"/>
+      <w:lvlText w:val="%1.%2"/>
+      <w:lvlJc w:val="left"/>
+      <w:pPr>
+        <w:ind w:left="567" w:hanging="567"/>
+      </w:pPr>
+      <w:rPr>
+        <w:rFonts w:hint="default"/>
+        <w:sz w:val="24"/>
+        <w:szCs w:val="24"/>
+      </w:rPr>
+    </w:lvl>
+    <w:lvl w:ilvl="2" w:tentative="0">
+      <w:start w:val="1"/>
+      <w:numFmt w:val="decimal"/>
+      <w:pStyle w:val="4"/>
+      <w:lvlText w:val="%1.%2.%3"/>
+      <w:lvlJc w:val="left"/>
+      <w:pPr>
+        <w:ind w:left="709" w:hanging="709"/>
+      </w:pPr>
+      <w:rPr>
+        <w:rFonts w:hint="default"/>
+        <w:b w:val="0"/>
+        <w:bCs w:val="0"/>
+        <w:sz w:val="24"/>
+        <w:szCs w:val="24"/>
+      </w:rPr>
+    </w:lvl>
+    <w:lvl w:ilvl="3" w:tentative="0">
+      <w:start w:val="1"/>
+      <w:numFmt w:val="decimal"/>
+      <w:lvlText w:val="%1.%2.%3.%4"/>
+      <w:lvlJc w:val="left"/>
+      <w:pPr>
+        <w:ind w:left="850" w:hanging="850"/>
+      </w:pPr>
+      <w:rPr>
+        <w:rFonts w:hint="default"/>
+        <w:b w:val="0"/>
+        <w:bCs w:val="0"/>
+        <w:sz w:val="24"/>
+        <w:szCs w:val="24"/>
+      </w:rPr>
+    </w:lvl>
+    <w:lvl w:ilvl="4" w:tentative="0">
+      <w:start w:val="1"/>
+      <w:numFmt w:val="decimal"/>
+      <w:lvlText w:val="%1.%2.%3.%4.%5"/>
+      <w:lvlJc w:val="left"/>
+      <w:pPr>
+        <w:ind w:left="991" w:hanging="991"/>
+      </w:pPr>
+      <w:rPr>
+        <w:rFonts w:hint="default"/>
+      </w:rPr>
+    </w:lvl>
+    <w:lvl w:ilvl="5" w:tentative="0">
+      <w:start w:val="1"/>
+      <w:numFmt w:val="decimal"/>
+      <w:lvlText w:val="%1.%2.%3.%4.%5.%6"/>
+      <w:lvlJc w:val="left"/>
+      <w:pPr>
+        <w:ind w:left="1134" w:hanging="1134"/>
+      </w:pPr>
+      <w:rPr>
+        <w:rFonts w:hint="default"/>
+      </w:rPr>
+    </w:lvl>
+    <w:lvl w:ilvl="6" w:tentative="0">
+      <w:start w:val="1"/>
+      <w:numFmt w:val="decimal"/>
+      <w:lvlText w:val="%1.%2.%3.%4.%5.%6.%7"/>
+      <w:lvlJc w:val="left"/>
+      <w:pPr>
+        <w:ind w:left="1275" w:hanging="1275"/>
+      </w:pPr>
+      <w:rPr>
+        <w:rFonts w:hint="default"/>
+      </w:rPr>
+    </w:lvl>
+    <w:lvl w:ilvl="7" w:tentative="0">
+      <w:start w:val="1"/>
+      <w:numFmt w:val="decimal"/>
+      <w:lvlText w:val="%1.%2.%3.%4.%5.%6.%7.%8."/>
+      <w:lvlJc w:val="left"/>
+      <w:pPr>
+        <w:ind w:left="1418" w:hanging="1418"/>
+      </w:pPr>
+      <w:rPr>
+        <w:rFonts w:hint="default"/>
+      </w:rPr>
+    </w:lvl>
+    <w:lvl w:ilvl="8" w:tentative="0">
+      <w:start w:val="1"/>
+      <w:numFmt w:val="decimal"/>
+      <w:lvlText w:val="%1.%2.%3.%4.%5.%6.%7.%8.%9."/>
+      <w:lvlJc w:val="left"/>
+      <w:pPr>
+        <w:ind w:left="1558" w:hanging="1558"/>
+      </w:pPr>
+      <w:rPr>
+        <w:rFonts w:hint="default"/>
+      </w:rPr>
+    </w:lvl>
+  </w:abstractNum>
+  <w:abstractNum w:abstractNumId="1">
+    <w:nsid w:val="F1447EA9"/>
+    <w:multiLevelType w:val="multilevel"/>
+    <w:tmpl w:val="F1447EA9"/>
     <w:lvl w:ilvl="0" w:tentative="0">
       <w:start w:val="1"/>
       <w:numFmt w:val="decimal"/>
@@ -4578,7 +5102,6 @@
       <w:start w:val="1"/>
       <w:numFmt w:val="decimal"/>
       <w:lvlRestart w:val="0"/>
-      <w:pStyle w:val="27"/>
       <w:lvlText w:val="%1.%2.%3.%4"/>
       <w:lvlJc w:val="left"/>
       <w:pPr>
@@ -4652,140 +5175,14 @@
       </w:rPr>
     </w:lvl>
   </w:abstractNum>
-  <w:abstractNum w:abstractNumId="1">
-    <w:nsid w:val="E4102B9A"/>
+  <w:abstractNum w:abstractNumId="2">
+    <w:nsid w:val="0B920954"/>
     <w:multiLevelType w:val="multilevel"/>
-    <w:tmpl w:val="E4102B9A"/>
+    <w:tmpl w:val="0B920954"/>
     <w:lvl w:ilvl="0" w:tentative="0">
       <w:start w:val="1"/>
       <w:numFmt w:val="decimal"/>
-      <w:lvlText w:val="%1"/>
-      <w:lvlJc w:val="left"/>
-      <w:pPr>
-        <w:ind w:left="425" w:hanging="425"/>
-      </w:pPr>
-      <w:rPr>
-        <w:rFonts w:hint="default"/>
-        <w:sz w:val="24"/>
-        <w:szCs w:val="24"/>
-      </w:rPr>
-    </w:lvl>
-    <w:lvl w:ilvl="1" w:tentative="0">
-      <w:start w:val="1"/>
-      <w:numFmt w:val="decimal"/>
-      <w:lvlText w:val="%1.%2"/>
-      <w:lvlJc w:val="left"/>
-      <w:pPr>
-        <w:ind w:left="567" w:hanging="567"/>
-      </w:pPr>
-      <w:rPr>
-        <w:rFonts w:hint="default"/>
-        <w:sz w:val="24"/>
-        <w:szCs w:val="24"/>
-      </w:rPr>
-    </w:lvl>
-    <w:lvl w:ilvl="2" w:tentative="0">
-      <w:start w:val="1"/>
-      <w:numFmt w:val="decimal"/>
-      <w:pStyle w:val="4"/>
-      <w:lvlText w:val="%1.%2.%3"/>
-      <w:lvlJc w:val="left"/>
-      <w:pPr>
-        <w:ind w:left="709" w:hanging="709"/>
-      </w:pPr>
-      <w:rPr>
-        <w:rFonts w:hint="default"/>
-        <w:b w:val="0"/>
-        <w:bCs w:val="0"/>
-        <w:sz w:val="24"/>
-        <w:szCs w:val="24"/>
-      </w:rPr>
-    </w:lvl>
-    <w:lvl w:ilvl="3" w:tentative="0">
-      <w:start w:val="1"/>
-      <w:numFmt w:val="decimal"/>
-      <w:lvlText w:val="%1.%2.%3.%4"/>
-      <w:lvlJc w:val="left"/>
-      <w:pPr>
-        <w:ind w:left="850" w:hanging="850"/>
-      </w:pPr>
-      <w:rPr>
-        <w:rFonts w:hint="default"/>
-        <w:b w:val="0"/>
-        <w:bCs w:val="0"/>
-        <w:sz w:val="24"/>
-        <w:szCs w:val="24"/>
-      </w:rPr>
-    </w:lvl>
-    <w:lvl w:ilvl="4" w:tentative="0">
-      <w:start w:val="1"/>
-      <w:numFmt w:val="decimal"/>
-      <w:lvlText w:val="%1.%2.%3.%4.%5"/>
-      <w:lvlJc w:val="left"/>
-      <w:pPr>
-        <w:ind w:left="991" w:hanging="991"/>
-      </w:pPr>
-      <w:rPr>
-        <w:rFonts w:hint="default"/>
-      </w:rPr>
-    </w:lvl>
-    <w:lvl w:ilvl="5" w:tentative="0">
-      <w:start w:val="1"/>
-      <w:numFmt w:val="decimal"/>
-      <w:lvlText w:val="%1.%2.%3.%4.%5.%6"/>
-      <w:lvlJc w:val="left"/>
-      <w:pPr>
-        <w:ind w:left="1134" w:hanging="1134"/>
-      </w:pPr>
-      <w:rPr>
-        <w:rFonts w:hint="default"/>
-      </w:rPr>
-    </w:lvl>
-    <w:lvl w:ilvl="6" w:tentative="0">
-      <w:start w:val="1"/>
-      <w:numFmt w:val="decimal"/>
-      <w:lvlText w:val="%1.%2.%3.%4.%5.%6.%7"/>
-      <w:lvlJc w:val="left"/>
-      <w:pPr>
-        <w:ind w:left="1275" w:hanging="1275"/>
-      </w:pPr>
-      <w:rPr>
-        <w:rFonts w:hint="default"/>
-      </w:rPr>
-    </w:lvl>
-    <w:lvl w:ilvl="7" w:tentative="0">
-      <w:start w:val="1"/>
-      <w:numFmt w:val="decimal"/>
-      <w:lvlText w:val="%1.%2.%3.%4.%5.%6.%7.%8."/>
-      <w:lvlJc w:val="left"/>
-      <w:pPr>
-        <w:ind w:left="1418" w:hanging="1418"/>
-      </w:pPr>
-      <w:rPr>
-        <w:rFonts w:hint="default"/>
-      </w:rPr>
-    </w:lvl>
-    <w:lvl w:ilvl="8" w:tentative="0">
-      <w:start w:val="1"/>
-      <w:numFmt w:val="decimal"/>
-      <w:lvlText w:val="%1.%2.%3.%4.%5.%6.%7.%8.%9."/>
-      <w:lvlJc w:val="left"/>
-      <w:pPr>
-        <w:ind w:left="1558" w:hanging="1558"/>
-      </w:pPr>
-      <w:rPr>
-        <w:rFonts w:hint="default"/>
-      </w:rPr>
-    </w:lvl>
-  </w:abstractNum>
-  <w:abstractNum w:abstractNumId="2">
-    <w:nsid w:val="F1447EA9"/>
-    <w:multiLevelType w:val="multilevel"/>
-    <w:tmpl w:val="F1447EA9"/>
-    <w:lvl w:ilvl="0" w:tentative="0">
-      <w:start w:val="1"/>
-      <w:numFmt w:val="decimal"/>
-      <w:pStyle w:val="24"/>
+      <w:pStyle w:val="27"/>
       <w:suff w:val="space"/>
       <w:lvlText w:val="%1"/>
       <w:lvlJc w:val="left"/>
@@ -4806,7 +5203,8 @@
     <w:lvl w:ilvl="1" w:tentative="0">
       <w:start w:val="1"/>
       <w:numFmt w:val="decimal"/>
-      <w:pStyle w:val="25"/>
+      <w:pStyle w:val="28"/>
+      <w:suff w:val="space"/>
       <w:lvlText w:val="%1.%2"/>
       <w:lvlJc w:val="left"/>
       <w:pPr>
@@ -4822,17 +5220,12 @@
         <w:color w:val="000000" w:themeColor="text1"/>
         <w:sz w:val="24"/>
         <w:szCs w:val="24"/>
-        <w14:textFill>
-          <w14:solidFill>
-            <w14:schemeClr w14:val="tx1"/>
-          </w14:solidFill>
-        </w14:textFill>
       </w:rPr>
     </w:lvl>
     <w:lvl w:ilvl="2" w:tentative="0">
       <w:start w:val="1"/>
       <w:numFmt w:val="decimal"/>
-      <w:pStyle w:val="26"/>
+      <w:pStyle w:val="29"/>
       <w:suff w:val="space"/>
       <w:lvlText w:val="%1.%2.%3"/>
       <w:lvlJc w:val="left"/>
@@ -4847,23 +5240,18 @@
         <w:color w:val="000000" w:themeColor="text1"/>
         <w:sz w:val="24"/>
         <w:szCs w:val="24"/>
-        <w14:textFill>
-          <w14:solidFill>
-            <w14:schemeClr w14:val="tx1"/>
-          </w14:solidFill>
-        </w14:textFill>
       </w:rPr>
     </w:lvl>
     <w:lvl w:ilvl="3" w:tentative="0">
       <w:start w:val="1"/>
-      <w:pStyle w:val="27"/>
       <w:numFmt w:val="decimal"/>
-      <w:lvlRestart w:val="0"/>
+      <w:pStyle w:val="30"/>
+      <w:suff w:val="space"/>
       <w:lvlText w:val="%1.%2.%3.%4"/>
       <w:lvlJc w:val="left"/>
       <w:pPr>
         <w:tabs>
-          <w:tab w:val="left" w:pos="0"/>
+          <w:tab w:val="left" w:pos="420"/>
         </w:tabs>
         <w:ind w:left="0" w:leftChars="0" w:firstLine="0" w:firstLineChars="0"/>
       </w:pPr>
@@ -4873,11 +5261,15 @@
     </w:lvl>
     <w:lvl w:ilvl="4" w:tentative="0">
       <w:start w:val="1"/>
-      <w:pStyle w:val="34"/>
       <w:numFmt w:val="decimal"/>
+      <w:pStyle w:val="31"/>
+      <w:suff w:val="space"/>
       <w:lvlText w:val="%1.%2.%3.%4.%5"/>
       <w:lvlJc w:val="left"/>
       <w:pPr>
+        <w:tabs>
+          <w:tab w:val="left" w:pos="420"/>
+        </w:tabs>
         <w:ind w:left="991" w:hanging="991"/>
       </w:pPr>
       <w:rPr>
@@ -4886,11 +5278,15 @@
     </w:lvl>
     <w:lvl w:ilvl="5" w:tentative="0">
       <w:start w:val="1"/>
-      <w:pStyle w:val="35"/>
       <w:numFmt w:val="decimal"/>
+      <w:pStyle w:val="32"/>
+      <w:suff w:val="space"/>
       <w:lvlText w:val="%1.%2.%3.%4.%5.%6"/>
       <w:lvlJc w:val="left"/>
       <w:pPr>
+        <w:tabs>
+          <w:tab w:val="left" w:pos="420"/>
+        </w:tabs>
         <w:ind w:left="1134" w:hanging="1134"/>
       </w:pPr>
       <w:rPr>
@@ -4900,9 +5296,13 @@
     <w:lvl w:ilvl="6" w:tentative="0">
       <w:start w:val="1"/>
       <w:numFmt w:val="decimal"/>
+      <w:suff w:val="space"/>
       <w:lvlText w:val="%1.%2.%3.%4.%5.%6.%7"/>
       <w:lvlJc w:val="left"/>
       <w:pPr>
+        <w:tabs>
+          <w:tab w:val="left" w:pos="420"/>
+        </w:tabs>
         <w:ind w:left="1275" w:hanging="1275"/>
       </w:pPr>
       <w:rPr>
@@ -5237,13 +5637,40 @@
     <w:abstractNumId w:val="3"/>
   </w:num>
   <w:num w:numId="3">
-    <w:abstractNumId w:val="1"/>
+    <w:abstractNumId w:val="0"/>
   </w:num>
   <w:num w:numId="4">
     <w:abstractNumId w:val="2"/>
   </w:num>
   <w:num w:numId="5">
-    <w:abstractNumId w:val="0"/>
+    <w:abstractNumId w:val="1"/>
+    <w:lvlOverride w:ilvl="0">
+      <w:startOverride w:val="1"/>
+    </w:lvlOverride>
+    <w:lvlOverride w:ilvl="1">
+      <w:startOverride w:val="1"/>
+    </w:lvlOverride>
+    <w:lvlOverride w:ilvl="2">
+      <w:startOverride w:val="1"/>
+    </w:lvlOverride>
+    <w:lvlOverride w:ilvl="3">
+      <w:startOverride w:val="1"/>
+    </w:lvlOverride>
+    <w:lvlOverride w:ilvl="4">
+      <w:startOverride w:val="1"/>
+    </w:lvlOverride>
+    <w:lvlOverride w:ilvl="5">
+      <w:startOverride w:val="1"/>
+    </w:lvlOverride>
+    <w:lvlOverride w:ilvl="6">
+      <w:startOverride w:val="1"/>
+    </w:lvlOverride>
+    <w:lvlOverride w:ilvl="7">
+      <w:startOverride w:val="1"/>
+    </w:lvlOverride>
+    <w:lvlOverride w:ilvl="8">
+      <w:startOverride w:val="1"/>
+    </w:lvlOverride>
   </w:num>
 </w:numbering>
 </file>
@@ -5601,13 +6028,13 @@
       <w:sz w:val="32"/>
     </w:rPr>
   </w:style>
-  <w:style w:type="character" w:default="1" w:styleId="14">
+  <w:style w:type="character" w:default="1" w:styleId="17">
     <w:name w:val="Default Paragraph Font"/>
     <w:semiHidden/>
     <w:qFormat/>
     <w:uiPriority w:val="0"/>
   </w:style>
-  <w:style w:type="table" w:default="1" w:styleId="12">
+  <w:style w:type="table" w:default="1" w:styleId="15">
     <w:name w:val="Normal Table"/>
     <w:semiHidden/>
     <w:qFormat/>
@@ -5635,6 +6062,15 @@
     </w:rPr>
   </w:style>
   <w:style w:type="paragraph" w:styleId="6">
+    <w:name w:val="toc 5"/>
+    <w:basedOn w:val="1"/>
+    <w:next w:val="1"/>
+    <w:uiPriority w:val="0"/>
+    <w:pPr>
+      <w:ind w:left="0" w:leftChars="0"/>
+    </w:pPr>
+  </w:style>
+  <w:style w:type="paragraph" w:styleId="7">
     <w:name w:val="toc 3"/>
     <w:basedOn w:val="1"/>
     <w:next w:val="1"/>
@@ -5642,10 +6078,10 @@
     <w:qFormat/>
     <w:uiPriority w:val="39"/>
     <w:pPr>
-      <w:ind w:left="840" w:leftChars="400"/>
+      <w:ind w:left="0" w:leftChars="0"/>
     </w:pPr>
   </w:style>
-  <w:style w:type="paragraph" w:styleId="7">
+  <w:style w:type="paragraph" w:styleId="8">
     <w:name w:val="footer"/>
     <w:basedOn w:val="1"/>
     <w:qFormat/>
@@ -5662,7 +6098,7 @@
       <w:sz w:val="18"/>
     </w:rPr>
   </w:style>
-  <w:style w:type="paragraph" w:styleId="8">
+  <w:style w:type="paragraph" w:styleId="9">
     <w:name w:val="header"/>
     <w:basedOn w:val="1"/>
     <w:qFormat/>
@@ -5687,7 +6123,7 @@
       <w:sz w:val="18"/>
     </w:rPr>
   </w:style>
-  <w:style w:type="paragraph" w:styleId="9">
+  <w:style w:type="paragraph" w:styleId="10">
     <w:name w:val="toc 1"/>
     <w:basedOn w:val="1"/>
     <w:next w:val="1"/>
@@ -5698,21 +6134,42 @@
       <w:szCs w:val="21"/>
     </w:rPr>
   </w:style>
-  <w:style w:type="paragraph" w:styleId="10">
+  <w:style w:type="paragraph" w:styleId="11">
+    <w:name w:val="toc 4"/>
+    <w:basedOn w:val="1"/>
+    <w:next w:val="1"/>
+    <w:uiPriority w:val="0"/>
+    <w:pPr>
+      <w:ind w:left="0" w:leftChars="0"/>
+    </w:pPr>
+  </w:style>
+  <w:style w:type="paragraph" w:styleId="12">
+    <w:name w:val="toc 6"/>
+    <w:basedOn w:val="1"/>
+    <w:next w:val="1"/>
+    <w:uiPriority w:val="0"/>
+    <w:pPr>
+      <w:ind w:left="0" w:leftChars="0"/>
+    </w:pPr>
+  </w:style>
+  <w:style w:type="paragraph" w:styleId="13">
     <w:name w:val="table of figures"/>
     <w:basedOn w:val="1"/>
     <w:next w:val="1"/>
     <w:qFormat/>
     <w:uiPriority w:val="99"/>
     <w:pPr>
-      <w:ind w:left="200" w:leftChars="200" w:hanging="200" w:hangingChars="200"/>
+      <w:tabs>
+        <w:tab w:val="right" w:leader="dot" w:pos="8787"/>
+      </w:tabs>
+      <w:ind w:left="0" w:leftChars="0" w:hanging="200" w:hangingChars="200"/>
     </w:pPr>
     <w:rPr>
-      <w:rFonts w:ascii="Times New Roman" w:hAnsi="Times New Roman" w:eastAsia="宋体" w:cs="Times New Roman"/>
+      <w:rFonts w:cs="宋体"/>
       <w:szCs w:val="24"/>
     </w:rPr>
   </w:style>
-  <w:style w:type="paragraph" w:styleId="11">
+  <w:style w:type="paragraph" w:styleId="14">
     <w:name w:val="toc 2"/>
     <w:basedOn w:val="1"/>
     <w:next w:val="1"/>
@@ -5720,15 +6177,12 @@
     <w:qFormat/>
     <w:uiPriority w:val="39"/>
     <w:pPr>
-      <w:ind w:left="420" w:leftChars="200"/>
+      <w:ind w:left="0" w:leftChars="0"/>
     </w:pPr>
-    <w:rPr>
-      <w:szCs w:val="21"/>
-    </w:rPr>
   </w:style>
-  <w:style w:type="table" w:styleId="13">
+  <w:style w:type="table" w:styleId="16">
     <w:name w:val="Table Grid"/>
-    <w:basedOn w:val="12"/>
+    <w:basedOn w:val="15"/>
     <w:qFormat/>
     <w:uiPriority w:val="59"/>
     <w:tblPr>
@@ -5742,15 +6196,15 @@
       </w:tblBorders>
     </w:tblPr>
   </w:style>
-  <w:style w:type="character" w:styleId="15">
+  <w:style w:type="character" w:styleId="18">
     <w:name w:val="page number"/>
-    <w:basedOn w:val="14"/>
+    <w:basedOn w:val="17"/>
     <w:qFormat/>
     <w:uiPriority w:val="0"/>
   </w:style>
-  <w:style w:type="character" w:styleId="16">
+  <w:style w:type="character" w:styleId="19">
     <w:name w:val="Hyperlink"/>
-    <w:basedOn w:val="14"/>
+    <w:basedOn w:val="17"/>
     <w:unhideWhenUsed/>
     <w:qFormat/>
     <w:uiPriority w:val="99"/>
@@ -5764,7 +6218,7 @@
       </w14:textFill>
     </w:rPr>
   </w:style>
-  <w:style w:type="paragraph" w:customStyle="1" w:styleId="17">
+  <w:style w:type="paragraph" w:customStyle="1" w:styleId="20">
     <w:name w:val="表格正文"/>
     <w:basedOn w:val="1"/>
     <w:qFormat/>
@@ -5778,7 +6232,7 @@
       <w:sz w:val="21"/>
     </w:rPr>
   </w:style>
-  <w:style w:type="paragraph" w:customStyle="1" w:styleId="18">
+  <w:style w:type="paragraph" w:customStyle="1" w:styleId="21">
     <w:name w:val="表格表头"/>
     <w:basedOn w:val="1"/>
     <w:qFormat/>
@@ -5792,7 +6246,7 @@
       <w:rFonts w:hint="eastAsia"/>
     </w:rPr>
   </w:style>
-  <w:style w:type="paragraph" w:customStyle="1" w:styleId="19">
+  <w:style w:type="paragraph" w:customStyle="1" w:styleId="22">
     <w:name w:val="主标题"/>
     <w:qFormat/>
     <w:uiPriority w:val="0"/>
@@ -5807,7 +6261,7 @@
       <w:lang w:val="en-US" w:eastAsia="en-US" w:bidi="ar-SA"/>
     </w:rPr>
   </w:style>
-  <w:style w:type="paragraph" w:customStyle="1" w:styleId="20">
+  <w:style w:type="paragraph" w:customStyle="1" w:styleId="23">
     <w:name w:val="文档标题"/>
     <w:qFormat/>
     <w:uiPriority w:val="0"/>
@@ -5820,7 +6274,7 @@
       <w:sz w:val="44"/>
     </w:rPr>
   </w:style>
-  <w:style w:type="paragraph" w:customStyle="1" w:styleId="21">
+  <w:style w:type="paragraph" w:customStyle="1" w:styleId="24">
     <w:name w:val="KL文档标题"/>
     <w:qFormat/>
     <w:uiPriority w:val="0"/>
@@ -5833,7 +6287,7 @@
       <w:sz w:val="44"/>
     </w:rPr>
   </w:style>
-  <w:style w:type="paragraph" w:customStyle="1" w:styleId="22">
+  <w:style w:type="paragraph" w:customStyle="1" w:styleId="25">
     <w:name w:val="KL表格表头"/>
     <w:qFormat/>
     <w:uiPriority w:val="0"/>
@@ -5847,7 +6301,7 @@
       <w:sz w:val="21"/>
     </w:rPr>
   </w:style>
-  <w:style w:type="paragraph" w:customStyle="1" w:styleId="23">
+  <w:style w:type="paragraph" w:customStyle="1" w:styleId="26">
     <w:name w:val="KL表格文字"/>
     <w:qFormat/>
     <w:uiPriority w:val="0"/>
@@ -5860,9 +6314,9 @@
       <w:sz w:val="21"/>
     </w:rPr>
   </w:style>
-  <w:style w:type="paragraph" w:customStyle="1" w:styleId="24">
+  <w:style w:type="paragraph" w:customStyle="1" w:styleId="27">
     <w:name w:val="KL一级标题"/>
-    <w:next w:val="25"/>
+    <w:next w:val="28"/>
     <w:qFormat/>
     <w:uiPriority w:val="0"/>
     <w:pPr>
@@ -5880,10 +6334,10 @@
       <w:szCs w:val="24"/>
     </w:rPr>
   </w:style>
-  <w:style w:type="paragraph" w:customStyle="1" w:styleId="25">
+  <w:style w:type="paragraph" w:customStyle="1" w:styleId="28">
     <w:name w:val="KL二级标题"/>
-    <w:basedOn w:val="24"/>
-    <w:next w:val="26"/>
+    <w:basedOn w:val="27"/>
+    <w:next w:val="29"/>
     <w:qFormat/>
     <w:uiPriority w:val="0"/>
     <w:pPr>
@@ -5899,10 +6353,10 @@
       <w:outlineLvl w:val="1"/>
     </w:pPr>
   </w:style>
-  <w:style w:type="paragraph" w:customStyle="1" w:styleId="26">
+  <w:style w:type="paragraph" w:customStyle="1" w:styleId="29">
     <w:name w:val="KL三级标题"/>
-    <w:basedOn w:val="25"/>
-    <w:next w:val="27"/>
+    <w:basedOn w:val="28"/>
+    <w:next w:val="30"/>
     <w:qFormat/>
     <w:uiPriority w:val="0"/>
     <w:pPr>
@@ -5919,10 +6373,10 @@
       <w:color w:val="auto"/>
     </w:rPr>
   </w:style>
-  <w:style w:type="paragraph" w:customStyle="1" w:styleId="27">
+  <w:style w:type="paragraph" w:customStyle="1" w:styleId="30">
     <w:name w:val="KL四级标题"/>
-    <w:basedOn w:val="26"/>
-    <w:next w:val="28"/>
+    <w:basedOn w:val="29"/>
+    <w:next w:val="31"/>
     <w:qFormat/>
     <w:uiPriority w:val="0"/>
     <w:pPr>
@@ -5930,23 +6384,18 @@
         <w:ilvl w:val="3"/>
         <w:numId w:val="4"/>
       </w:numPr>
+      <w:spacing w:line="360" w:lineRule="auto"/>
       <w:ind w:left="0" w:firstLine="0"/>
       <w:outlineLvl w:val="3"/>
-      <w:spacing w:line="360" w:lineRule="auto"/>
     </w:pPr>
     <w:rPr>
-      <w:rFonts w:ascii="宋体" w:hAnsi="宋体" w:eastAsia="宋体" w:cs="宋体"/>
-      <w:color w:val="auto"/>
-      <w:b w:val="0"/>
-      <w:bCs w:val="0"/>
-      <w:sz w:val="24"/>
-      <w:szCs w:val="24"/>
+      <w:rFonts w:cs="宋体"/>
     </w:rPr>
   </w:style>
-  <w:style w:type="paragraph" w:customStyle="1" w:styleId="34">
+  <w:style w:type="paragraph" w:customStyle="1" w:styleId="31">
     <w:name w:val="KL五级标题"/>
-    <w:basedOn w:val="27"/>
-    <w:next w:val="28"/>
+    <w:basedOn w:val="30"/>
+    <w:next w:val="32"/>
     <w:qFormat/>
     <w:uiPriority w:val="0"/>
     <w:pPr>
@@ -5954,23 +6403,15 @@
         <w:ilvl w:val="4"/>
         <w:numId w:val="4"/>
       </w:numPr>
-      <w:ind w:left="0" w:firstLine="0"/>
+      <w:spacing w:line="360" w:lineRule="auto"/>
+      <w:ind w:left="991" w:hanging="991"/>
       <w:outlineLvl w:val="4"/>
-      <w:spacing w:line="360" w:lineRule="auto"/>
     </w:pPr>
-    <w:rPr>
-      <w:rFonts w:ascii="宋体" w:hAnsi="宋体" w:eastAsia="宋体" w:cs="宋体"/>
-      <w:color w:val="auto"/>
-      <w:b w:val="0"/>
-      <w:bCs w:val="0"/>
-      <w:sz w:val="24"/>
-      <w:szCs w:val="24"/>
-    </w:rPr>
   </w:style>
-  <w:style w:type="paragraph" w:customStyle="1" w:styleId="35">
+  <w:style w:type="paragraph" w:customStyle="1" w:styleId="32">
     <w:name w:val="KL六级标题"/>
-    <w:basedOn w:val="34"/>
-    <w:next w:val="28"/>
+    <w:basedOn w:val="31"/>
+    <w:next w:val="33"/>
     <w:qFormat/>
     <w:uiPriority w:val="0"/>
     <w:pPr>
@@ -5978,20 +6419,18 @@
         <w:ilvl w:val="5"/>
         <w:numId w:val="4"/>
       </w:numPr>
-      <w:ind w:left="0" w:firstLine="0"/>
+      <w:spacing w:line="360" w:lineRule="auto"/>
+      <w:ind w:left="1134" w:hanging="1134"/>
       <w:outlineLvl w:val="5"/>
-      <w:spacing w:line="360" w:lineRule="auto"/>
     </w:pPr>
     <w:rPr>
       <w:rFonts w:ascii="宋体" w:hAnsi="宋体" w:eastAsia="宋体" w:cs="宋体"/>
       <w:color w:val="auto"/>
-      <w:b w:val="0"/>
-      <w:bCs w:val="0"/>
       <w:sz w:val="24"/>
       <w:szCs w:val="24"/>
     </w:rPr>
   </w:style>
-  <w:style w:type="paragraph" w:customStyle="1" w:styleId="28">
+  <w:style w:type="paragraph" w:customStyle="1" w:styleId="33">
     <w:name w:val="KL正文"/>
     <w:qFormat/>
     <w:uiPriority w:val="0"/>
@@ -6005,7 +6444,7 @@
       <w:szCs w:val="24"/>
     </w:rPr>
   </w:style>
-  <w:style w:type="paragraph" w:customStyle="1" w:styleId="29">
+  <w:style w:type="paragraph" w:customStyle="1" w:styleId="34">
     <w:name w:val="KL主标题"/>
     <w:qFormat/>
     <w:uiPriority w:val="0"/>
@@ -6018,7 +6457,7 @@
       <w:sz w:val="44"/>
     </w:rPr>
   </w:style>
-  <w:style w:type="paragraph" w:customStyle="1" w:styleId="30">
+  <w:style w:type="paragraph" w:customStyle="1" w:styleId="35">
     <w:name w:val="KL页眉"/>
     <w:basedOn w:val="1"/>
     <w:qFormat/>
@@ -6031,10 +6470,10 @@
       <w:sz w:val="21"/>
     </w:rPr>
   </w:style>
-  <w:style w:type="paragraph" w:customStyle="1" w:styleId="31">
+  <w:style w:type="paragraph" w:customStyle="1" w:styleId="36">
     <w:name w:val="KL题注"/>
     <w:basedOn w:val="5"/>
-    <w:next w:val="28"/>
+    <w:next w:val="33"/>
     <w:qFormat/>
     <w:uiPriority w:val="0"/>
     <w:pPr>
@@ -6047,7 +6486,7 @@
       <w:szCs w:val="24"/>
     </w:rPr>
   </w:style>
-  <w:style w:type="paragraph" w:customStyle="1" w:styleId="32">
+  <w:style w:type="paragraph" w:customStyle="1" w:styleId="37">
     <w:name w:val="KL页脚"/>
     <w:qFormat/>
     <w:uiPriority w:val="0"/>
@@ -6061,7 +6500,7 @@
       <w:szCs w:val="21"/>
     </w:rPr>
   </w:style>
-  <w:style w:type="paragraph" w:customStyle="1" w:styleId="33">
+  <w:style w:type="paragraph" w:customStyle="1" w:styleId="38">
     <w:name w:val="KL图片"/>
     <w:qFormat/>
     <w:uiPriority w:val="0"/>
@@ -6075,7 +6514,7 @@
       <w:szCs w:val="24"/>
     </w:rPr>
   </w:style>
-  <w:style w:type="paragraph" w:styleId="36">
+  <w:style w:type="paragraph" w:styleId="39">
     <w:name w:val="List Paragraph"/>
     <w:basedOn w:val="1"/>
     <w:qFormat/>
@@ -6084,7 +6523,7 @@
       <w:ind w:firstLine="420" w:firstLineChars="200"/>
     </w:pPr>
   </w:style>
-  <w:style w:type="paragraph" w:customStyle="1" w:styleId="37">
+  <w:style w:type="paragraph" w:customStyle="1" w:styleId="40">
     <w:name w:val="我的正文"/>
     <w:basedOn w:val="1"/>
     <w:qFormat/>
@@ -6097,6 +6536,63 @@
       <w:rFonts w:ascii="Times New Roman" w:hAnsi="Times New Roman" w:eastAsia="宋体" w:cs="Times New Roman"/>
       <w:sz w:val="24"/>
       <w:szCs w:val="24"/>
+    </w:rPr>
+  </w:style>
+  <w:style w:type="paragraph" w:customStyle="1" w:styleId="41">
+    <w:name w:val="WPSOffice手动目录 1"/>
+    <w:uiPriority w:val="0"/>
+    <w:pPr>
+      <w:ind w:leftChars="0"/>
+    </w:pPr>
+    <w:rPr>
+      <w:sz w:val="20"/>
+      <w:szCs w:val="20"/>
+    </w:rPr>
+  </w:style>
+  <w:style w:type="paragraph" w:customStyle="1" w:styleId="42">
+    <w:name w:val="WPSOffice手动目录 2"/>
+    <w:uiPriority w:val="0"/>
+    <w:pPr>
+      <w:ind w:leftChars="200"/>
+    </w:pPr>
+    <w:rPr>
+      <w:sz w:val="20"/>
+      <w:szCs w:val="20"/>
+    </w:rPr>
+  </w:style>
+  <w:style w:type="paragraph" w:customStyle="1" w:styleId="43">
+    <w:name w:val="WPSOffice手动目录 3"/>
+    <w:uiPriority w:val="0"/>
+    <w:pPr>
+      <w:ind w:leftChars="400"/>
+    </w:pPr>
+    <w:rPr>
+      <w:sz w:val="20"/>
+      <w:szCs w:val="20"/>
+    </w:rPr>
+  </w:style>
+  <w:style w:type="paragraph" w:customStyle="1" w:styleId="44">
+    <w:name w:val="KL目录"/>
+    <w:link w:val="45"/>
+    <w:uiPriority w:val="0"/>
+    <w:pPr>
+      <w:spacing w:beforeLines="0" w:afterLines="0" w:line="240" w:lineRule="auto"/>
+      <w:jc w:val="center"/>
+    </w:pPr>
+    <w:rPr>
+      <w:rFonts w:ascii="Calibri" w:hAnsi="Calibri" w:eastAsia="宋体"/>
+      <w:b/>
+      <w:sz w:val="28"/>
+    </w:rPr>
+  </w:style>
+  <w:style w:type="character" w:customStyle="1" w:styleId="45">
+    <w:name w:val="KL目录 Char"/>
+    <w:link w:val="44"/>
+    <w:uiPriority w:val="0"/>
+    <w:rPr>
+      <w:rFonts w:ascii="Calibri" w:hAnsi="Calibri" w:eastAsia="宋体"/>
+      <w:b/>
+      <w:sz w:val="28"/>
     </w:rPr>
   </w:style>
 </w:styles>

</xml_diff>

<commit_message>
chore: release docxspec 0.0.7
</commit_message>
<xml_diff>
--- a/src/docxspec/assets/docxspec_master_template.docx
+++ b/src/docxspec/assets/docxspec_master_template.docx
@@ -6,6 +6,7 @@
       <w:pPr>
         <w:pStyle w:val="31"/>
         <w:numPr>
+          <w:ilvl w:val="4"/>
           <w:numId w:val="0"/>
         </w:numPr>
         <w:spacing w:line="360" w:lineRule="auto"/>
@@ -86,6 +87,7 @@
       <w:pPr>
         <w:pStyle w:val="31"/>
         <w:numPr>
+          <w:ilvl w:val="4"/>
           <w:numId w:val="0"/>
         </w:numPr>
         <w:spacing w:before="156" w:beforeLines="50" w:after="156" w:afterLines="50" w:line="480" w:lineRule="auto"/>
@@ -113,6 +115,7 @@
       <w:pPr>
         <w:pStyle w:val="31"/>
         <w:numPr>
+          <w:ilvl w:val="4"/>
           <w:numId w:val="0"/>
         </w:numPr>
         <w:spacing w:before="156" w:beforeLines="50" w:after="156" w:afterLines="50" w:line="480" w:lineRule="auto"/>
@@ -166,6 +169,8 @@
           <w:lang w:eastAsia="zh-CN"/>
         </w:rPr>
       </w:pPr>
+      <w:bookmarkStart w:id="22" w:name="_GoBack"/>
+      <w:bookmarkEnd w:id="22"/>
     </w:p>
     <w:p>
       <w:pPr>
@@ -503,19 +508,16 @@
     </w:p>
     <w:p>
       <w:pPr>
-        <w:pStyle w:val="33"/>
-        <w:bidi w:val="0"/>
-        <w:ind w:left="0" w:leftChars="0" w:firstLine="0" w:firstLineChars="0"/>
-        <w:rPr>
-          <w:rFonts w:hint="eastAsia"/>
-          <w:lang w:eastAsia="zh-CN"/>
+        <w:spacing w:line="360" w:lineRule="auto"/>
+        <w:rPr>
+          <w:rFonts w:hint="eastAsia" w:ascii="宋体" w:hAnsi="宋体" w:eastAsia="宋体" w:cs="宋体"/>
+          <w:sz w:val="24"/>
+          <w:szCs w:val="24"/>
         </w:rPr>
       </w:pPr>
     </w:p>
     <w:p>
       <w:pPr>
-        <w:spacing w:line="360" w:lineRule="auto"/>
-        <w:jc w:val="center"/>
         <w:rPr>
           <w:rFonts w:hint="eastAsia" w:ascii="宋体" w:hAnsi="宋体" w:eastAsia="宋体" w:cs="宋体"/>
           <w:sz w:val="24"/>
@@ -528,117 +530,8 @@
           <w:sz w:val="24"/>
           <w:szCs w:val="24"/>
         </w:rPr>
-        <w:drawing>
-          <wp:inline distT="0" distB="0" distL="0" distR="0">
-            <wp:extent cx="1259205" cy="526415"/>
-            <wp:effectExtent l="0" t="0" r="17145" b="6985"/>
-            <wp:docPr id="5" name="图片 1" descr="Logo_KeLiang"/>
-            <wp:cNvGraphicFramePr>
-              <a:graphicFrameLocks xmlns:a="http://schemas.openxmlformats.org/drawingml/2006/main" noChangeAspect="1"/>
-            </wp:cNvGraphicFramePr>
-            <a:graphic xmlns:a="http://schemas.openxmlformats.org/drawingml/2006/main">
-              <a:graphicData uri="http://schemas.openxmlformats.org/drawingml/2006/picture">
-                <pic:pic xmlns:pic="http://schemas.openxmlformats.org/drawingml/2006/picture">
-                  <pic:nvPicPr>
-                    <pic:cNvPr id="5" name="图片 1" descr="Logo_KeLiang"/>
-                    <pic:cNvPicPr>
-                      <a:picLocks noChangeAspect="1" noChangeArrowheads="1"/>
-                    </pic:cNvPicPr>
-                  </pic:nvPicPr>
-                  <pic:blipFill>
-                    <a:blip r:embed="rId17" cstate="print"/>
-                    <a:srcRect/>
-                    <a:stretch>
-                      <a:fillRect/>
-                    </a:stretch>
-                  </pic:blipFill>
-                  <pic:spPr>
-                    <a:xfrm>
-                      <a:off x="0" y="0"/>
-                      <a:ext cx="1259205" cy="526415"/>
-                    </a:xfrm>
-                    <a:prstGeom prst="rect">
-                      <a:avLst/>
-                    </a:prstGeom>
-                    <a:noFill/>
-                    <a:ln w="9525">
-                      <a:noFill/>
-                      <a:miter lim="800000"/>
-                      <a:headEnd/>
-                      <a:tailEnd/>
-                    </a:ln>
-                  </pic:spPr>
-                </pic:pic>
-              </a:graphicData>
-            </a:graphic>
-          </wp:inline>
-        </w:drawing>
-      </w:r>
-    </w:p>
-    <w:p>
-      <w:pPr>
-        <w:spacing w:line="360" w:lineRule="auto"/>
-        <w:jc w:val="center"/>
-        <w:rPr>
-          <w:rFonts w:hint="eastAsia" w:ascii="宋体" w:hAnsi="宋体" w:eastAsia="宋体" w:cs="宋体"/>
-          <w:sz w:val="28"/>
-          <w:szCs w:val="32"/>
-        </w:rPr>
-      </w:pPr>
-      <w:r>
-        <w:rPr>
-          <w:rFonts w:hint="eastAsia" w:ascii="宋体" w:hAnsi="宋体" w:eastAsia="宋体" w:cs="宋体"/>
-          <w:sz w:val="28"/>
-          <w:szCs w:val="32"/>
-        </w:rPr>
-        <w:t>上海科梁信息科技股份有限公司</w:t>
-      </w:r>
-    </w:p>
-    <w:p>
-      <w:pPr>
-        <w:spacing w:line="360" w:lineRule="auto"/>
-        <w:jc w:val="center"/>
-        <w:rPr>
-          <w:rFonts w:hint="eastAsia" w:ascii="宋体" w:hAnsi="宋体" w:eastAsia="宋体" w:cs="宋体"/>
-          <w:sz w:val="28"/>
-          <w:szCs w:val="24"/>
-        </w:rPr>
-      </w:pPr>
-      <w:r>
-        <w:rPr>
-          <w:rFonts w:hint="eastAsia" w:ascii="宋体" w:hAnsi="宋体" w:eastAsia="宋体" w:cs="宋体"/>
-          <w:sz w:val="28"/>
-          <w:szCs w:val="32"/>
-        </w:rPr>
-        <w:t>二〇二</w:t>
-      </w:r>
-      <w:r>
-        <w:rPr>
-          <w:rFonts w:hint="eastAsia" w:ascii="宋体" w:hAnsi="宋体" w:eastAsia="宋体" w:cs="宋体"/>
-          <w:sz w:val="28"/>
-          <w:szCs w:val="32"/>
-          <w:lang w:val="en-US" w:eastAsia="zh-CN"/>
-        </w:rPr>
-        <w:t>六</w:t>
-      </w:r>
-      <w:r>
-        <w:rPr>
-          <w:rFonts w:hint="eastAsia" w:ascii="宋体" w:hAnsi="宋体" w:eastAsia="宋体" w:cs="宋体"/>
-          <w:sz w:val="28"/>
-          <w:szCs w:val="32"/>
-        </w:rPr>
-        <w:t>年六月</w:t>
-      </w:r>
-    </w:p>
-    <w:p>
-      <w:pPr>
-        <w:spacing w:line="360" w:lineRule="auto"/>
-        <w:rPr>
-          <w:rFonts w:hint="eastAsia" w:ascii="宋体" w:hAnsi="宋体" w:eastAsia="宋体" w:cs="宋体"/>
-          <w:sz w:val="24"/>
-          <w:szCs w:val="24"/>
-        </w:rPr>
-      </w:pPr>
+        <w:br w:type="page"/>
+      </w:r>
     </w:p>
     <w:p>
       <w:pPr>
@@ -1992,7 +1885,7 @@
     </w:p>
     <w:p>
       <w:pPr>
-        <w:pStyle w:val="44"/>
+        <w:pStyle w:val="39"/>
         <w:bidi w:val="0"/>
         <w:rPr>
           <w:rFonts w:hint="eastAsia" w:ascii="宋体" w:hAnsi="宋体" w:eastAsia="宋体" w:cs="宋体"/>
@@ -2224,7 +2117,7 @@
     </w:p>
     <w:p>
       <w:pPr>
-        <w:pStyle w:val="44"/>
+        <w:pStyle w:val="39"/>
         <w:bidi w:val="0"/>
         <w:rPr>
           <w:rFonts w:hint="eastAsia" w:ascii="宋体" w:hAnsi="宋体" w:eastAsia="宋体" w:cs="宋体"/>
@@ -2538,8 +2431,8 @@
           <w:rFonts w:hint="eastAsia" w:ascii="宋体" w:hAnsi="宋体" w:eastAsia="宋体" w:cs="宋体"/>
         </w:rPr>
       </w:pPr>
-      <w:bookmarkStart w:id="0" w:name="_Toc32099"/>
-      <w:bookmarkStart w:id="1" w:name="_Toc22766"/>
+      <w:bookmarkStart w:id="0" w:name="_Toc22766"/>
+      <w:bookmarkStart w:id="1" w:name="_Toc32099"/>
       <w:r>
         <w:rPr>
           <w:rFonts w:hint="eastAsia" w:ascii="宋体" w:hAnsi="宋体" w:eastAsia="宋体" w:cs="宋体"/>
@@ -2573,8 +2466,8 @@
           <w:rFonts w:hint="eastAsia" w:ascii="宋体" w:hAnsi="宋体" w:eastAsia="宋体" w:cs="宋体"/>
         </w:rPr>
       </w:pPr>
-      <w:bookmarkStart w:id="2" w:name="_Toc21864"/>
-      <w:bookmarkStart w:id="3" w:name="_Toc14165"/>
+      <w:bookmarkStart w:id="2" w:name="_Toc14165"/>
+      <w:bookmarkStart w:id="3" w:name="_Toc21864"/>
       <w:r>
         <w:rPr>
           <w:rFonts w:hint="eastAsia" w:ascii="宋体" w:hAnsi="宋体" w:eastAsia="宋体" w:cs="宋体"/>
@@ -2702,8 +2595,6 @@
         </w:rPr>
         <w:tab/>
       </w:r>
-      <w:bookmarkStart w:id="22" w:name="_GoBack"/>
-      <w:bookmarkEnd w:id="22"/>
     </w:p>
     <w:p>
       <w:pPr>
@@ -2847,12 +2738,6 @@
             <w:insideH w:val="single" w:color="auto" w:sz="4" w:space="0"/>
             <w:insideV w:val="single" w:color="auto" w:sz="4" w:space="0"/>
           </w:tblBorders>
-          <w:tblCellMar>
-            <w:top w:w="0" w:type="dxa"/>
-            <w:left w:w="108" w:type="dxa"/>
-            <w:bottom w:w="0" w:type="dxa"/>
-            <w:right w:w="108" w:type="dxa"/>
-          </w:tblCellMar>
         </w:tblPrEx>
         <w:tc>
           <w:tcPr>
@@ -2992,7 +2877,7 @@
                     </pic:cNvPicPr>
                   </pic:nvPicPr>
                   <pic:blipFill>
-                    <a:blip r:embed="rId18"/>
+                    <a:blip r:embed="rId17"/>
                     <a:stretch>
                       <a:fillRect/>
                     </a:stretch>
@@ -3132,8 +3017,8 @@
           <w:rFonts w:hint="eastAsia" w:ascii="宋体" w:hAnsi="宋体" w:eastAsia="宋体" w:cs="宋体"/>
         </w:rPr>
       </w:pPr>
-      <w:bookmarkStart w:id="11" w:name="_Toc24400"/>
-      <w:bookmarkStart w:id="12" w:name="_Toc3113"/>
+      <w:bookmarkStart w:id="11" w:name="_Toc3113"/>
+      <w:bookmarkStart w:id="12" w:name="_Toc24400"/>
       <w:r>
         <w:rPr>
           <w:rFonts w:hint="eastAsia" w:ascii="宋体" w:hAnsi="宋体" w:eastAsia="宋体" w:cs="宋体"/>
@@ -3151,8 +3036,8 @@
           <w:rFonts w:hint="eastAsia" w:ascii="宋体" w:hAnsi="宋体" w:eastAsia="宋体" w:cs="宋体"/>
         </w:rPr>
       </w:pPr>
-      <w:bookmarkStart w:id="13" w:name="_Toc26507"/>
-      <w:bookmarkStart w:id="14" w:name="_Toc23681"/>
+      <w:bookmarkStart w:id="13" w:name="_Toc23681"/>
+      <w:bookmarkStart w:id="14" w:name="_Toc26507"/>
       <w:r>
         <w:rPr>
           <w:rFonts w:hint="eastAsia" w:ascii="宋体" w:hAnsi="宋体" w:eastAsia="宋体" w:cs="宋体"/>
@@ -3171,8 +3056,8 @@
           <w:rFonts w:hint="eastAsia" w:ascii="宋体" w:hAnsi="宋体" w:eastAsia="宋体" w:cs="宋体"/>
         </w:rPr>
       </w:pPr>
-      <w:bookmarkStart w:id="15" w:name="_Toc20980"/>
-      <w:bookmarkStart w:id="16" w:name="_Toc19566"/>
+      <w:bookmarkStart w:id="15" w:name="_Toc19566"/>
+      <w:bookmarkStart w:id="16" w:name="_Toc20980"/>
       <w:r>
         <w:rPr>
           <w:rFonts w:hint="eastAsia" w:ascii="宋体" w:hAnsi="宋体" w:eastAsia="宋体" w:cs="宋体"/>
@@ -3187,6 +3072,7 @@
       <w:pPr>
         <w:pStyle w:val="30"/>
         <w:numPr>
+          <w:ilvl w:val="3"/>
           <w:numId w:val="5"/>
         </w:numPr>
         <w:bidi w:val="0"/>
@@ -3216,6 +3102,7 @@
       <w:pPr>
         <w:pStyle w:val="31"/>
         <w:numPr>
+          <w:ilvl w:val="4"/>
           <w:numId w:val="5"/>
         </w:numPr>
         <w:rPr>
@@ -3553,7 +3440,7 @@
                     </pic:cNvPicPr>
                   </pic:nvPicPr>
                   <pic:blipFill>
-                    <a:blip r:embed="rId18"/>
+                    <a:blip r:embed="rId17"/>
                     <a:stretch>
                       <a:fillRect/>
                     </a:stretch>
@@ -5220,6 +5107,11 @@
         <w:color w:val="000000" w:themeColor="text1"/>
         <w:sz w:val="24"/>
         <w:szCs w:val="24"/>
+        <w14:textFill>
+          <w14:solidFill>
+            <w14:schemeClr w14:val="tx1"/>
+          </w14:solidFill>
+        </w14:textFill>
       </w:rPr>
     </w:lvl>
     <w:lvl w:ilvl="2" w:tentative="0">
@@ -5240,6 +5132,11 @@
         <w:color w:val="000000" w:themeColor="text1"/>
         <w:sz w:val="24"/>
         <w:szCs w:val="24"/>
+        <w14:textFill>
+          <w14:solidFill>
+            <w14:schemeClr w14:val="tx1"/>
+          </w14:solidFill>
+        </w14:textFill>
       </w:rPr>
     </w:lvl>
     <w:lvl w:ilvl="3" w:tentative="0">
@@ -5708,9 +5605,9 @@
     <w:lsdException w:qFormat="1" w:uiPriority="39" w:semiHidden="0" w:name="toc 1"/>
     <w:lsdException w:qFormat="1" w:uiPriority="39" w:semiHidden="0" w:name="toc 2"/>
     <w:lsdException w:qFormat="1" w:uiPriority="39" w:semiHidden="0" w:name="toc 3"/>
-    <w:lsdException w:unhideWhenUsed="0" w:uiPriority="0" w:semiHidden="0" w:name="toc 4"/>
-    <w:lsdException w:unhideWhenUsed="0" w:uiPriority="0" w:semiHidden="0" w:name="toc 5"/>
-    <w:lsdException w:unhideWhenUsed="0" w:uiPriority="0" w:semiHidden="0" w:name="toc 6"/>
+    <w:lsdException w:qFormat="1" w:unhideWhenUsed="0" w:uiPriority="0" w:semiHidden="0" w:name="toc 4"/>
+    <w:lsdException w:qFormat="1" w:unhideWhenUsed="0" w:uiPriority="0" w:semiHidden="0" w:name="toc 5"/>
+    <w:lsdException w:qFormat="1" w:unhideWhenUsed="0" w:uiPriority="0" w:semiHidden="0" w:name="toc 6"/>
     <w:lsdException w:unhideWhenUsed="0" w:uiPriority="0" w:semiHidden="0" w:name="toc 7"/>
     <w:lsdException w:unhideWhenUsed="0" w:uiPriority="0" w:semiHidden="0" w:name="toc 8"/>
     <w:lsdException w:unhideWhenUsed="0" w:uiPriority="0" w:semiHidden="0" w:name="toc 9"/>
@@ -6065,6 +5962,7 @@
     <w:name w:val="toc 5"/>
     <w:basedOn w:val="1"/>
     <w:next w:val="1"/>
+    <w:qFormat/>
     <w:uiPriority w:val="0"/>
     <w:pPr>
       <w:ind w:left="0" w:leftChars="0"/>
@@ -6138,6 +6036,7 @@
     <w:name w:val="toc 4"/>
     <w:basedOn w:val="1"/>
     <w:next w:val="1"/>
+    <w:qFormat/>
     <w:uiPriority w:val="0"/>
     <w:pPr>
       <w:ind w:left="0" w:leftChars="0"/>
@@ -6147,6 +6046,7 @@
     <w:name w:val="toc 6"/>
     <w:basedOn w:val="1"/>
     <w:next w:val="1"/>
+    <w:qFormat/>
     <w:uiPriority w:val="0"/>
     <w:pPr>
       <w:ind w:left="0" w:leftChars="0"/>
@@ -6514,7 +6414,22 @@
       <w:szCs w:val="24"/>
     </w:rPr>
   </w:style>
-  <w:style w:type="paragraph" w:styleId="39">
+  <w:style w:type="paragraph" w:customStyle="1" w:styleId="39">
+    <w:name w:val="KL目录"/>
+    <w:link w:val="45"/>
+    <w:qFormat/>
+    <w:uiPriority w:val="0"/>
+    <w:pPr>
+      <w:spacing w:beforeLines="0" w:afterLines="0" w:line="240" w:lineRule="auto"/>
+      <w:jc w:val="center"/>
+    </w:pPr>
+    <w:rPr>
+      <w:rFonts w:ascii="Calibri" w:hAnsi="Calibri" w:eastAsia="宋体" w:cstheme="minorBidi"/>
+      <w:b/>
+      <w:sz w:val="28"/>
+    </w:rPr>
+  </w:style>
+  <w:style w:type="paragraph" w:styleId="40">
     <w:name w:val="List Paragraph"/>
     <w:basedOn w:val="1"/>
     <w:qFormat/>
@@ -6523,7 +6438,7 @@
       <w:ind w:firstLine="420" w:firstLineChars="200"/>
     </w:pPr>
   </w:style>
-  <w:style w:type="paragraph" w:customStyle="1" w:styleId="40">
+  <w:style w:type="paragraph" w:customStyle="1" w:styleId="41">
     <w:name w:val="我的正文"/>
     <w:basedOn w:val="1"/>
     <w:qFormat/>
@@ -6538,56 +6453,49 @@
       <w:szCs w:val="24"/>
     </w:rPr>
   </w:style>
-  <w:style w:type="paragraph" w:customStyle="1" w:styleId="41">
+  <w:style w:type="paragraph" w:customStyle="1" w:styleId="42">
     <w:name w:val="WPSOffice手动目录 1"/>
+    <w:qFormat/>
     <w:uiPriority w:val="0"/>
     <w:pPr>
       <w:ind w:leftChars="0"/>
     </w:pPr>
     <w:rPr>
+      <w:rFonts w:asciiTheme="minorHAnsi" w:hAnsiTheme="minorHAnsi" w:eastAsiaTheme="minorEastAsia" w:cstheme="minorBidi"/>
       <w:sz w:val="20"/>
       <w:szCs w:val="20"/>
     </w:rPr>
   </w:style>
-  <w:style w:type="paragraph" w:customStyle="1" w:styleId="42">
+  <w:style w:type="paragraph" w:customStyle="1" w:styleId="43">
     <w:name w:val="WPSOffice手动目录 2"/>
+    <w:qFormat/>
     <w:uiPriority w:val="0"/>
     <w:pPr>
       <w:ind w:leftChars="200"/>
     </w:pPr>
     <w:rPr>
+      <w:rFonts w:asciiTheme="minorHAnsi" w:hAnsiTheme="minorHAnsi" w:eastAsiaTheme="minorEastAsia" w:cstheme="minorBidi"/>
       <w:sz w:val="20"/>
       <w:szCs w:val="20"/>
     </w:rPr>
   </w:style>
-  <w:style w:type="paragraph" w:customStyle="1" w:styleId="43">
+  <w:style w:type="paragraph" w:customStyle="1" w:styleId="44">
     <w:name w:val="WPSOffice手动目录 3"/>
+    <w:qFormat/>
     <w:uiPriority w:val="0"/>
     <w:pPr>
       <w:ind w:leftChars="400"/>
     </w:pPr>
     <w:rPr>
+      <w:rFonts w:asciiTheme="minorHAnsi" w:hAnsiTheme="minorHAnsi" w:eastAsiaTheme="minorEastAsia" w:cstheme="minorBidi"/>
       <w:sz w:val="20"/>
       <w:szCs w:val="20"/>
     </w:rPr>
   </w:style>
-  <w:style w:type="paragraph" w:customStyle="1" w:styleId="44">
-    <w:name w:val="KL目录"/>
-    <w:link w:val="45"/>
-    <w:uiPriority w:val="0"/>
-    <w:pPr>
-      <w:spacing w:beforeLines="0" w:afterLines="0" w:line="240" w:lineRule="auto"/>
-      <w:jc w:val="center"/>
-    </w:pPr>
-    <w:rPr>
-      <w:rFonts w:ascii="Calibri" w:hAnsi="Calibri" w:eastAsia="宋体"/>
-      <w:b/>
-      <w:sz w:val="28"/>
-    </w:rPr>
-  </w:style>
   <w:style w:type="character" w:customStyle="1" w:styleId="45">
     <w:name w:val="KL目录 Char"/>
-    <w:link w:val="44"/>
+    <w:link w:val="39"/>
+    <w:qFormat/>
     <w:uiPriority w:val="0"/>
     <w:rPr>
       <w:rFonts w:ascii="Calibri" w:hAnsi="Calibri" w:eastAsia="宋体"/>

</xml_diff>